<commit_message>
Simplify backend service contracts and docs
</commit_message>
<xml_diff>
--- a/第1组-在线教育辅助教学系统需求分析说明书.docx
+++ b/第1组-在线教育辅助教学系统需求分析说明书.docx
@@ -6,7 +6,7 @@
       <w:pPr>
         <w:jc w:val="center"/>
         <w:rPr>
-          <w:rFonts w:ascii="Agency FB" w:eastAsia="Agency FB" w:hAnsi="Agency FB" w:cs="Agency FB" w:hint="eastAsia"/>
+          <w:rFonts w:ascii="Agency FB" w:eastAsia="Agency FB" w:hAnsi="Agency FB" w:cs="Agency FB"/>
           <w:bCs/>
           <w:color w:val="000000"/>
           <w:sz w:val="16"/>
@@ -131,7 +131,7 @@
         <w:ind w:firstLine="883"/>
         <w:jc w:val="center"/>
         <w:rPr>
-          <w:rFonts w:ascii="Verdana" w:eastAsia="黑体" w:hAnsi="Verdana" w:hint="eastAsia"/>
+          <w:rFonts w:ascii="Verdana" w:eastAsia="黑体" w:hAnsi="Verdana"/>
           <w:b/>
           <w:bCs/>
           <w:sz w:val="44"/>
@@ -150,7 +150,7 @@
         <w:ind w:firstLine="883"/>
         <w:jc w:val="center"/>
         <w:rPr>
-          <w:rFonts w:ascii="Verdana" w:eastAsia="黑体" w:hAnsi="Verdana" w:hint="eastAsia"/>
+          <w:rFonts w:ascii="Verdana" w:eastAsia="黑体" w:hAnsi="Verdana"/>
           <w:bCs/>
           <w:sz w:val="84"/>
           <w:szCs w:val="84"/>
@@ -196,7 +196,7 @@
         <w:ind w:firstLine="560"/>
         <w:jc w:val="center"/>
         <w:rPr>
-          <w:rFonts w:ascii="黑体" w:eastAsia="黑体"/>
+          <w:rFonts w:ascii="黑体" w:eastAsia="黑体" w:hint="eastAsia"/>
           <w:sz w:val="28"/>
           <w:szCs w:val="28"/>
           <w:lang w:eastAsia="zh-CN"/>
@@ -216,7 +216,25 @@
       <w:pPr>
         <w:ind w:firstLine="480"/>
         <w:rPr>
-          <w:rFonts w:ascii="Calibri" w:hAnsi="Calibri" w:hint="eastAsia"/>
+          <w:rFonts w:ascii="Calibri" w:hAnsi="Calibri"/>
+          <w:lang w:eastAsia="zh-CN"/>
+        </w:rPr>
+      </w:pPr>
+    </w:p>
+    <w:p>
+      <w:pPr>
+        <w:ind w:firstLine="480"/>
+        <w:rPr>
+          <w:rFonts w:ascii="Calibri" w:hAnsi="Calibri"/>
+          <w:lang w:eastAsia="zh-CN"/>
+        </w:rPr>
+      </w:pPr>
+    </w:p>
+    <w:p>
+      <w:pPr>
+        <w:ind w:firstLine="480"/>
+        <w:rPr>
+          <w:rFonts w:ascii="Calibri" w:hAnsi="Calibri"/>
           <w:lang w:eastAsia="zh-CN"/>
         </w:rPr>
       </w:pPr>
@@ -232,61 +250,37 @@
     </w:p>
     <w:tbl>
       <w:tblPr>
-        <w:tblpPr w:leftFromText="180" w:rightFromText="180" w:vertAnchor="text" w:horzAnchor="page" w:tblpX="2162" w:tblpY="325"/>
-        <w:tblOverlap w:val="never"/>
-        <w:tblW w:w="8330" w:type="dxa"/>
-        <w:tblBorders>
-          <w:top w:val="single" w:sz="8" w:space="0" w:color="7BA0CD"/>
-          <w:left w:val="single" w:sz="8" w:space="0" w:color="7BA0CD"/>
-          <w:bottom w:val="single" w:sz="8" w:space="0" w:color="7BA0CD"/>
-          <w:right w:val="single" w:sz="8" w:space="0" w:color="7BA0CD"/>
-          <w:insideH w:val="single" w:sz="8" w:space="0" w:color="7BA0CD"/>
-          <w:insideV w:val="single" w:sz="8" w:space="0" w:color="7BA0CD"/>
-        </w:tblBorders>
-        <w:tblLayout w:type="fixed"/>
-        <w:tblLook w:val="0000" w:firstRow="0" w:lastRow="0" w:firstColumn="0" w:lastColumn="0" w:noHBand="0" w:noVBand="0"/>
+        <w:tblStyle w:val="aff1"/>
+        <w:tblW w:w="0" w:type="auto"/>
+        <w:jc w:val="center"/>
+        <w:tblLook w:val="04A0" w:firstRow="1" w:lastRow="0" w:firstColumn="1" w:lastColumn="0" w:noHBand="0" w:noVBand="1"/>
       </w:tblPr>
       <w:tblGrid>
-        <w:gridCol w:w="1809"/>
-        <w:gridCol w:w="2410"/>
-        <w:gridCol w:w="4111"/>
+        <w:gridCol w:w="2531"/>
+        <w:gridCol w:w="2531"/>
+        <w:gridCol w:w="2533"/>
       </w:tblGrid>
       <w:tr>
         <w:trPr>
-          <w:trHeight w:val="457"/>
+          <w:trHeight w:val="252"/>
+          <w:jc w:val="center"/>
         </w:trPr>
         <w:tc>
           <w:tcPr>
-            <w:tcW w:w="1809" w:type="dxa"/>
-            <w:tcBorders>
-              <w:top w:val="single" w:sz="8" w:space="0" w:color="7BA0CD"/>
-              <w:left w:val="single" w:sz="8" w:space="0" w:color="7BA0CD"/>
-              <w:bottom w:val="single" w:sz="8" w:space="0" w:color="7BA0CD"/>
-              <w:right w:val="single" w:sz="8" w:space="0" w:color="7BA0CD"/>
-            </w:tcBorders>
-            <w:shd w:val="clear" w:color="auto" w:fill="A7BFDE"/>
-          </w:tcPr>
-          <w:p>
-            <w:pPr>
-              <w:widowControl w:val="0"/>
-              <w:spacing w:line="360" w:lineRule="auto"/>
-              <w:ind w:firstLine="420"/>
+            <w:tcW w:w="2531" w:type="dxa"/>
+          </w:tcPr>
+          <w:p>
+            <w:pPr>
+              <w:ind w:firstLine="0"/>
               <w:jc w:val="center"/>
               <w:rPr>
-                <w:b/>
-                <w:bCs/>
-                <w:kern w:val="2"/>
-                <w:sz w:val="21"/>
-                <w:lang w:eastAsia="zh-CN"/>
-              </w:rPr>
-            </w:pPr>
-            <w:r>
-              <w:rPr>
-                <w:rFonts w:hint="eastAsia"/>
-                <w:bCs/>
-                <w:kern w:val="2"/>
-                <w:sz w:val="21"/>
-                <w:szCs w:val="24"/>
+                <w:rFonts w:ascii="Calibri" w:hAnsi="Calibri"/>
+                <w:lang w:eastAsia="zh-CN"/>
+              </w:rPr>
+            </w:pPr>
+            <w:r>
+              <w:rPr>
+                <w:rFonts w:ascii="Calibri" w:hAnsi="Calibri" w:hint="eastAsia"/>
                 <w:lang w:eastAsia="zh-CN"/>
               </w:rPr>
               <w:t>版本号</w:t>
@@ -295,35 +289,20 @@
         </w:tc>
         <w:tc>
           <w:tcPr>
-            <w:tcW w:w="2410" w:type="dxa"/>
-            <w:tcBorders>
-              <w:top w:val="single" w:sz="8" w:space="0" w:color="7BA0CD"/>
-              <w:left w:val="single" w:sz="8" w:space="0" w:color="7BA0CD"/>
-              <w:bottom w:val="single" w:sz="8" w:space="0" w:color="7BA0CD"/>
-              <w:right w:val="single" w:sz="8" w:space="0" w:color="7BA0CD"/>
-            </w:tcBorders>
-            <w:shd w:val="clear" w:color="auto" w:fill="A7BFDE"/>
-          </w:tcPr>
-          <w:p>
-            <w:pPr>
-              <w:widowControl w:val="0"/>
-              <w:spacing w:line="360" w:lineRule="auto"/>
-              <w:ind w:firstLine="422"/>
+            <w:tcW w:w="2531" w:type="dxa"/>
+          </w:tcPr>
+          <w:p>
+            <w:pPr>
+              <w:ind w:firstLine="0"/>
               <w:jc w:val="center"/>
               <w:rPr>
-                <w:b/>
-                <w:kern w:val="2"/>
-                <w:sz w:val="21"/>
-                <w:lang w:eastAsia="zh-CN"/>
-              </w:rPr>
-            </w:pPr>
-            <w:r>
-              <w:rPr>
-                <w:rFonts w:hint="eastAsia"/>
-                <w:b/>
-                <w:kern w:val="2"/>
-                <w:sz w:val="21"/>
-                <w:szCs w:val="24"/>
+                <w:rFonts w:ascii="Calibri" w:hAnsi="Calibri"/>
+                <w:lang w:eastAsia="zh-CN"/>
+              </w:rPr>
+            </w:pPr>
+            <w:r>
+              <w:rPr>
+                <w:rFonts w:ascii="Calibri" w:hAnsi="Calibri" w:hint="eastAsia"/>
                 <w:lang w:eastAsia="zh-CN"/>
               </w:rPr>
               <w:t>时间</w:t>
@@ -332,34 +311,20 @@
         </w:tc>
         <w:tc>
           <w:tcPr>
-            <w:tcW w:w="4111" w:type="dxa"/>
-            <w:tcBorders>
-              <w:top w:val="single" w:sz="8" w:space="0" w:color="7BA0CD"/>
-              <w:left w:val="single" w:sz="8" w:space="0" w:color="7BA0CD"/>
-              <w:bottom w:val="single" w:sz="8" w:space="0" w:color="7BA0CD"/>
-              <w:right w:val="single" w:sz="8" w:space="0" w:color="7BA0CD"/>
-            </w:tcBorders>
-            <w:shd w:val="clear" w:color="auto" w:fill="A7BFDE"/>
-          </w:tcPr>
-          <w:p>
-            <w:pPr>
-              <w:widowControl w:val="0"/>
-              <w:spacing w:line="360" w:lineRule="auto"/>
-              <w:ind w:firstLine="422"/>
+            <w:tcW w:w="2533" w:type="dxa"/>
+          </w:tcPr>
+          <w:p>
+            <w:pPr>
+              <w:ind w:firstLine="0"/>
               <w:jc w:val="center"/>
               <w:rPr>
-                <w:b/>
-                <w:kern w:val="2"/>
-                <w:sz w:val="21"/>
-                <w:lang w:eastAsia="zh-CN"/>
-              </w:rPr>
-            </w:pPr>
-            <w:r>
-              <w:rPr>
-                <w:rFonts w:hint="eastAsia"/>
-                <w:b/>
-                <w:kern w:val="2"/>
-                <w:sz w:val="21"/>
+                <w:rFonts w:ascii="Calibri" w:hAnsi="Calibri"/>
+                <w:lang w:eastAsia="zh-CN"/>
+              </w:rPr>
+            </w:pPr>
+            <w:r>
+              <w:rPr>
+                <w:rFonts w:ascii="Calibri" w:hAnsi="Calibri" w:hint="eastAsia"/>
                 <w:lang w:eastAsia="zh-CN"/>
               </w:rPr>
               <w:t>小组成员</w:t>
@@ -369,129 +334,84 @@
       </w:tr>
       <w:tr>
         <w:trPr>
-          <w:trHeight w:val="567"/>
+          <w:trHeight w:val="247"/>
+          <w:jc w:val="center"/>
         </w:trPr>
         <w:tc>
           <w:tcPr>
-            <w:tcW w:w="1809" w:type="dxa"/>
-            <w:tcBorders>
-              <w:top w:val="single" w:sz="8" w:space="0" w:color="7BA0CD"/>
-              <w:left w:val="single" w:sz="8" w:space="0" w:color="7BA0CD"/>
-              <w:bottom w:val="single" w:sz="8" w:space="0" w:color="7BA0CD"/>
-              <w:right w:val="single" w:sz="8" w:space="0" w:color="7BA0CD"/>
-            </w:tcBorders>
-            <w:shd w:val="clear" w:color="auto" w:fill="FFFFFF"/>
-          </w:tcPr>
-          <w:p>
-            <w:pPr>
-              <w:widowControl w:val="0"/>
-              <w:spacing w:line="360" w:lineRule="auto"/>
-              <w:ind w:firstLine="422"/>
+            <w:tcW w:w="2531" w:type="dxa"/>
+          </w:tcPr>
+          <w:p>
+            <w:pPr>
+              <w:ind w:firstLine="0"/>
               <w:jc w:val="center"/>
               <w:rPr>
-                <w:b/>
-                <w:bCs/>
-                <w:kern w:val="2"/>
-                <w:sz w:val="21"/>
-                <w:lang w:eastAsia="zh-CN"/>
-              </w:rPr>
-            </w:pPr>
-            <w:r>
-              <w:rPr>
-                <w:rFonts w:hint="eastAsia"/>
-                <w:b/>
-                <w:bCs/>
-                <w:kern w:val="2"/>
-                <w:sz w:val="21"/>
-                <w:lang w:eastAsia="zh-CN"/>
-              </w:rPr>
-              <w:t>v1.0</w:t>
-            </w:r>
-          </w:p>
-        </w:tc>
-        <w:tc>
-          <w:tcPr>
-            <w:tcW w:w="2410" w:type="dxa"/>
-            <w:tcBorders>
-              <w:top w:val="single" w:sz="8" w:space="0" w:color="7BA0CD"/>
-              <w:left w:val="single" w:sz="8" w:space="0" w:color="7BA0CD"/>
-              <w:bottom w:val="single" w:sz="8" w:space="0" w:color="7BA0CD"/>
-              <w:right w:val="single" w:sz="8" w:space="0" w:color="7BA0CD"/>
-            </w:tcBorders>
-            <w:shd w:val="clear" w:color="auto" w:fill="FFFFFF"/>
-          </w:tcPr>
-          <w:p>
-            <w:pPr>
-              <w:widowControl w:val="0"/>
-              <w:spacing w:line="360" w:lineRule="auto"/>
-              <w:ind w:firstLine="420"/>
+                <w:rFonts w:ascii="Calibri" w:hAnsi="Calibri" w:hint="eastAsia"/>
+                <w:lang w:eastAsia="zh-CN"/>
+              </w:rPr>
+            </w:pPr>
+            <w:r>
+              <w:rPr>
+                <w:rFonts w:ascii="Calibri" w:hAnsi="Calibri"/>
+                <w:lang w:eastAsia="zh-CN"/>
+              </w:rPr>
+              <w:t>V</w:t>
+            </w:r>
+            <w:r>
+              <w:rPr>
+                <w:rFonts w:ascii="Calibri" w:hAnsi="Calibri" w:hint="eastAsia"/>
+                <w:lang w:eastAsia="zh-CN"/>
+              </w:rPr>
+              <w:t>1.0</w:t>
+            </w:r>
+          </w:p>
+        </w:tc>
+        <w:tc>
+          <w:tcPr>
+            <w:tcW w:w="2531" w:type="dxa"/>
+          </w:tcPr>
+          <w:p>
+            <w:pPr>
+              <w:ind w:firstLine="0"/>
               <w:jc w:val="center"/>
               <w:rPr>
-                <w:kern w:val="2"/>
-                <w:sz w:val="21"/>
-                <w:lang w:eastAsia="zh-CN"/>
-              </w:rPr>
-            </w:pPr>
-            <w:r>
-              <w:rPr>
-                <w:rFonts w:ascii="Verdana" w:hAnsi="Verdana" w:hint="eastAsia"/>
-                <w:kern w:val="2"/>
-                <w:sz w:val="21"/>
-                <w:szCs w:val="21"/>
-                <w:lang w:eastAsia="zh-CN"/>
-              </w:rPr>
-              <w:t>202</w:t>
-            </w:r>
-            <w:r>
-              <w:rPr>
-                <w:rFonts w:ascii="Verdana" w:hAnsi="Verdana" w:hint="eastAsia"/>
-                <w:kern w:val="2"/>
-                <w:sz w:val="21"/>
-                <w:szCs w:val="21"/>
-                <w:lang w:eastAsia="zh-CN"/>
-              </w:rPr>
-              <w:t>6-07-07</w:t>
-            </w:r>
-          </w:p>
-        </w:tc>
-        <w:tc>
-          <w:tcPr>
-            <w:tcW w:w="4111" w:type="dxa"/>
-            <w:tcBorders>
-              <w:top w:val="single" w:sz="8" w:space="0" w:color="7BA0CD"/>
-              <w:left w:val="single" w:sz="8" w:space="0" w:color="7BA0CD"/>
-              <w:bottom w:val="single" w:sz="8" w:space="0" w:color="7BA0CD"/>
-              <w:right w:val="single" w:sz="8" w:space="0" w:color="7BA0CD"/>
-            </w:tcBorders>
-            <w:shd w:val="clear" w:color="auto" w:fill="FFFFFF"/>
-          </w:tcPr>
-          <w:p>
-            <w:pPr>
-              <w:widowControl w:val="0"/>
-              <w:spacing w:line="360" w:lineRule="auto"/>
-              <w:ind w:firstLine="420"/>
+                <w:rFonts w:ascii="Calibri" w:hAnsi="Calibri" w:hint="eastAsia"/>
+                <w:lang w:eastAsia="zh-CN"/>
+              </w:rPr>
+            </w:pPr>
+            <w:r>
+              <w:rPr>
+                <w:rFonts w:ascii="Calibri" w:hAnsi="Calibri" w:hint="eastAsia"/>
+                <w:lang w:eastAsia="zh-CN"/>
+              </w:rPr>
+              <w:t>2026-07-07</w:t>
+            </w:r>
+          </w:p>
+        </w:tc>
+        <w:tc>
+          <w:tcPr>
+            <w:tcW w:w="2533" w:type="dxa"/>
+          </w:tcPr>
+          <w:p>
+            <w:pPr>
+              <w:ind w:firstLine="0"/>
               <w:jc w:val="center"/>
               <w:rPr>
-                <w:kern w:val="2"/>
-                <w:sz w:val="21"/>
-                <w:lang w:eastAsia="zh-CN"/>
-              </w:rPr>
-            </w:pPr>
-            <w:r>
-              <w:rPr>
-                <w:rFonts w:hint="eastAsia"/>
-                <w:kern w:val="2"/>
-                <w:sz w:val="21"/>
-                <w:lang w:eastAsia="zh-CN"/>
-              </w:rPr>
-              <w:t>黄坤伦、童飞、</w:t>
+                <w:rFonts w:ascii="Calibri" w:hAnsi="Calibri" w:hint="eastAsia"/>
+                <w:lang w:eastAsia="zh-CN"/>
+              </w:rPr>
+            </w:pPr>
+            <w:r>
+              <w:rPr>
+                <w:rFonts w:ascii="Calibri" w:hAnsi="Calibri" w:hint="eastAsia"/>
+                <w:lang w:eastAsia="zh-CN"/>
+              </w:rPr>
+              <w:t>童飞、黄坤伦、</w:t>
             </w:r>
             <w:proofErr w:type="gramStart"/>
             <w:r>
               <w:rPr>
-                <w:rFonts w:hint="eastAsia"/>
-                <w:kern w:val="2"/>
-                <w:sz w:val="21"/>
+                <w:rFonts w:ascii="Calibri" w:hAnsi="Calibri" w:hint="eastAsia"/>
                 <w:lang w:eastAsia="zh-CN"/>
               </w:rPr>
               <w:t>于施贤</w:t>
@@ -501,6 +421,24 @@
         </w:tc>
       </w:tr>
     </w:tbl>
+    <w:p>
+      <w:pPr>
+        <w:ind w:firstLine="480"/>
+        <w:rPr>
+          <w:rFonts w:ascii="Calibri" w:hAnsi="Calibri"/>
+          <w:lang w:eastAsia="zh-CN"/>
+        </w:rPr>
+      </w:pPr>
+    </w:p>
+    <w:p>
+      <w:pPr>
+        <w:ind w:firstLine="480"/>
+        <w:rPr>
+          <w:rFonts w:ascii="Calibri" w:hAnsi="Calibri" w:hint="eastAsia"/>
+          <w:lang w:eastAsia="zh-CN"/>
+        </w:rPr>
+      </w:pPr>
+    </w:p>
     <w:p>
       <w:pPr>
         <w:ind w:firstLine="0"/>
@@ -537,7 +475,7 @@
           <w:tab w:val="right" w:leader="dot" w:pos="9169"/>
         </w:tabs>
         <w:rPr>
-          <w:rFonts w:asciiTheme="minorHAnsi" w:eastAsiaTheme="minorEastAsia" w:hAnsiTheme="minorHAnsi" w:hint="eastAsia"/>
+          <w:rFonts w:asciiTheme="minorHAnsi" w:eastAsiaTheme="minorEastAsia" w:hAnsiTheme="minorHAnsi"/>
           <w:noProof/>
           <w:kern w:val="2"/>
           <w:szCs w:val="24"/>
@@ -643,7 +581,7 @@
         </w:tabs>
         <w:ind w:left="440"/>
         <w:rPr>
-          <w:rFonts w:asciiTheme="minorHAnsi" w:eastAsiaTheme="minorEastAsia" w:hAnsiTheme="minorHAnsi" w:hint="eastAsia"/>
+          <w:rFonts w:asciiTheme="minorHAnsi" w:eastAsiaTheme="minorEastAsia" w:hAnsiTheme="minorHAnsi"/>
           <w:noProof/>
           <w:kern w:val="2"/>
           <w:szCs w:val="24"/>
@@ -740,7 +678,7 @@
         </w:tabs>
         <w:ind w:left="440"/>
         <w:rPr>
-          <w:rFonts w:asciiTheme="minorHAnsi" w:eastAsiaTheme="minorEastAsia" w:hAnsiTheme="minorHAnsi" w:hint="eastAsia"/>
+          <w:rFonts w:asciiTheme="minorHAnsi" w:eastAsiaTheme="minorEastAsia" w:hAnsiTheme="minorHAnsi"/>
           <w:noProof/>
           <w:kern w:val="2"/>
           <w:szCs w:val="24"/>
@@ -837,7 +775,7 @@
         </w:tabs>
         <w:ind w:left="440"/>
         <w:rPr>
-          <w:rFonts w:asciiTheme="minorHAnsi" w:eastAsiaTheme="minorEastAsia" w:hAnsiTheme="minorHAnsi" w:hint="eastAsia"/>
+          <w:rFonts w:asciiTheme="minorHAnsi" w:eastAsiaTheme="minorEastAsia" w:hAnsiTheme="minorHAnsi"/>
           <w:noProof/>
           <w:kern w:val="2"/>
           <w:szCs w:val="24"/>
@@ -934,7 +872,7 @@
         </w:tabs>
         <w:ind w:left="440"/>
         <w:rPr>
-          <w:rFonts w:asciiTheme="minorHAnsi" w:eastAsiaTheme="minorEastAsia" w:hAnsiTheme="minorHAnsi" w:hint="eastAsia"/>
+          <w:rFonts w:asciiTheme="minorHAnsi" w:eastAsiaTheme="minorEastAsia" w:hAnsiTheme="minorHAnsi"/>
           <w:noProof/>
           <w:kern w:val="2"/>
           <w:szCs w:val="24"/>
@@ -1029,7 +967,7 @@
           <w:tab w:val="right" w:leader="dot" w:pos="9169"/>
         </w:tabs>
         <w:rPr>
-          <w:rFonts w:asciiTheme="minorHAnsi" w:eastAsiaTheme="minorEastAsia" w:hAnsiTheme="minorHAnsi" w:hint="eastAsia"/>
+          <w:rFonts w:asciiTheme="minorHAnsi" w:eastAsiaTheme="minorEastAsia" w:hAnsiTheme="minorHAnsi"/>
           <w:noProof/>
           <w:kern w:val="2"/>
           <w:szCs w:val="24"/>
@@ -1126,7 +1064,7 @@
         </w:tabs>
         <w:ind w:left="440"/>
         <w:rPr>
-          <w:rFonts w:asciiTheme="minorHAnsi" w:eastAsiaTheme="minorEastAsia" w:hAnsiTheme="minorHAnsi" w:hint="eastAsia"/>
+          <w:rFonts w:asciiTheme="minorHAnsi" w:eastAsiaTheme="minorEastAsia" w:hAnsiTheme="minorHAnsi"/>
           <w:noProof/>
           <w:kern w:val="2"/>
           <w:szCs w:val="24"/>
@@ -1141,7 +1079,23 @@
             <w:noProof/>
             <w:lang w:eastAsia="zh-CN"/>
           </w:rPr>
-          <w:t>2.1 项目背景</w:t>
+          <w:t>2.1 项目</w:t>
+        </w:r>
+        <w:r>
+          <w:rPr>
+            <w:rStyle w:val="aff9"/>
+            <w:noProof/>
+            <w:lang w:eastAsia="zh-CN"/>
+          </w:rPr>
+          <w:t>背</w:t>
+        </w:r>
+        <w:r>
+          <w:rPr>
+            <w:rStyle w:val="aff9"/>
+            <w:noProof/>
+            <w:lang w:eastAsia="zh-CN"/>
+          </w:rPr>
+          <w:t>景</w:t>
         </w:r>
         <w:r>
           <w:rPr>
@@ -1223,7 +1177,7 @@
         </w:tabs>
         <w:ind w:left="440"/>
         <w:rPr>
-          <w:rFonts w:asciiTheme="minorHAnsi" w:eastAsiaTheme="minorEastAsia" w:hAnsiTheme="minorHAnsi" w:hint="eastAsia"/>
+          <w:rFonts w:asciiTheme="minorHAnsi" w:eastAsiaTheme="minorEastAsia" w:hAnsiTheme="minorHAnsi"/>
           <w:noProof/>
           <w:kern w:val="2"/>
           <w:szCs w:val="24"/>
@@ -1320,7 +1274,7 @@
         </w:tabs>
         <w:ind w:left="880"/>
         <w:rPr>
-          <w:rFonts w:asciiTheme="minorHAnsi" w:eastAsiaTheme="minorEastAsia" w:hAnsiTheme="minorHAnsi" w:hint="eastAsia"/>
+          <w:rFonts w:asciiTheme="minorHAnsi" w:eastAsiaTheme="minorEastAsia" w:hAnsiTheme="minorHAnsi"/>
           <w:noProof/>
           <w:kern w:val="2"/>
           <w:szCs w:val="24"/>
@@ -1335,7 +1289,23 @@
             <w:noProof/>
             <w:lang w:eastAsia="zh-CN"/>
           </w:rPr>
-          <w:t>2.2.1 系统整体业务流程</w:t>
+          <w:t>2.2.1 系统整体业务</w:t>
+        </w:r>
+        <w:r>
+          <w:rPr>
+            <w:rStyle w:val="aff9"/>
+            <w:noProof/>
+            <w:lang w:eastAsia="zh-CN"/>
+          </w:rPr>
+          <w:t>流</w:t>
+        </w:r>
+        <w:r>
+          <w:rPr>
+            <w:rStyle w:val="aff9"/>
+            <w:noProof/>
+            <w:lang w:eastAsia="zh-CN"/>
+          </w:rPr>
+          <w:t>程</w:t>
         </w:r>
         <w:r>
           <w:rPr>
@@ -1417,7 +1387,7 @@
         </w:tabs>
         <w:ind w:left="880"/>
         <w:rPr>
-          <w:rFonts w:asciiTheme="minorHAnsi" w:eastAsiaTheme="minorEastAsia" w:hAnsiTheme="minorHAnsi" w:hint="eastAsia"/>
+          <w:rFonts w:asciiTheme="minorHAnsi" w:eastAsiaTheme="minorEastAsia" w:hAnsiTheme="minorHAnsi"/>
           <w:noProof/>
           <w:kern w:val="2"/>
           <w:szCs w:val="24"/>
@@ -1514,7 +1484,7 @@
         </w:tabs>
         <w:ind w:left="880"/>
         <w:rPr>
-          <w:rFonts w:asciiTheme="minorHAnsi" w:eastAsiaTheme="minorEastAsia" w:hAnsiTheme="minorHAnsi" w:hint="eastAsia"/>
+          <w:rFonts w:asciiTheme="minorHAnsi" w:eastAsiaTheme="minorEastAsia" w:hAnsiTheme="minorHAnsi"/>
           <w:noProof/>
           <w:kern w:val="2"/>
           <w:szCs w:val="24"/>
@@ -1611,7 +1581,7 @@
         </w:tabs>
         <w:ind w:left="440"/>
         <w:rPr>
-          <w:rFonts w:asciiTheme="minorHAnsi" w:eastAsiaTheme="minorEastAsia" w:hAnsiTheme="minorHAnsi" w:hint="eastAsia"/>
+          <w:rFonts w:asciiTheme="minorHAnsi" w:eastAsiaTheme="minorEastAsia" w:hAnsiTheme="minorHAnsi"/>
           <w:noProof/>
           <w:kern w:val="2"/>
           <w:szCs w:val="24"/>
@@ -1707,7 +1677,7 @@
           <w:tab w:val="right" w:leader="dot" w:pos="9169"/>
         </w:tabs>
         <w:rPr>
-          <w:rFonts w:asciiTheme="minorHAnsi" w:eastAsiaTheme="minorEastAsia" w:hAnsiTheme="minorHAnsi" w:hint="eastAsia"/>
+          <w:rFonts w:asciiTheme="minorHAnsi" w:eastAsiaTheme="minorEastAsia" w:hAnsiTheme="minorHAnsi"/>
           <w:noProof/>
           <w:kern w:val="2"/>
           <w:szCs w:val="24"/>
@@ -1804,7 +1774,7 @@
         </w:tabs>
         <w:ind w:left="440"/>
         <w:rPr>
-          <w:rFonts w:asciiTheme="minorHAnsi" w:eastAsiaTheme="minorEastAsia" w:hAnsiTheme="minorHAnsi" w:hint="eastAsia"/>
+          <w:rFonts w:asciiTheme="minorHAnsi" w:eastAsiaTheme="minorEastAsia" w:hAnsiTheme="minorHAnsi"/>
           <w:noProof/>
           <w:kern w:val="2"/>
           <w:szCs w:val="24"/>
@@ -1901,7 +1871,7 @@
         </w:tabs>
         <w:ind w:left="880"/>
         <w:rPr>
-          <w:rFonts w:asciiTheme="minorHAnsi" w:eastAsiaTheme="minorEastAsia" w:hAnsiTheme="minorHAnsi" w:hint="eastAsia"/>
+          <w:rFonts w:asciiTheme="minorHAnsi" w:eastAsiaTheme="minorEastAsia" w:hAnsiTheme="minorHAnsi"/>
           <w:noProof/>
           <w:kern w:val="2"/>
           <w:szCs w:val="24"/>
@@ -1998,7 +1968,7 @@
         </w:tabs>
         <w:ind w:left="880"/>
         <w:rPr>
-          <w:rFonts w:asciiTheme="minorHAnsi" w:eastAsiaTheme="minorEastAsia" w:hAnsiTheme="minorHAnsi" w:hint="eastAsia"/>
+          <w:rFonts w:asciiTheme="minorHAnsi" w:eastAsiaTheme="minorEastAsia" w:hAnsiTheme="minorHAnsi"/>
           <w:noProof/>
           <w:kern w:val="2"/>
           <w:szCs w:val="24"/>
@@ -2094,7 +2064,7 @@
         </w:tabs>
         <w:ind w:left="880"/>
         <w:rPr>
-          <w:rFonts w:asciiTheme="minorHAnsi" w:eastAsiaTheme="minorEastAsia" w:hAnsiTheme="minorHAnsi" w:hint="eastAsia"/>
+          <w:rFonts w:asciiTheme="minorHAnsi" w:eastAsiaTheme="minorEastAsia" w:hAnsiTheme="minorHAnsi"/>
           <w:noProof/>
           <w:kern w:val="2"/>
           <w:szCs w:val="24"/>
@@ -2190,7 +2160,7 @@
         </w:tabs>
         <w:ind w:left="880"/>
         <w:rPr>
-          <w:rFonts w:asciiTheme="minorHAnsi" w:eastAsiaTheme="minorEastAsia" w:hAnsiTheme="minorHAnsi" w:hint="eastAsia"/>
+          <w:rFonts w:asciiTheme="minorHAnsi" w:eastAsiaTheme="minorEastAsia" w:hAnsiTheme="minorHAnsi"/>
           <w:noProof/>
           <w:kern w:val="2"/>
           <w:szCs w:val="24"/>
@@ -2286,7 +2256,7 @@
         </w:tabs>
         <w:ind w:left="880"/>
         <w:rPr>
-          <w:rFonts w:asciiTheme="minorHAnsi" w:eastAsiaTheme="minorEastAsia" w:hAnsiTheme="minorHAnsi" w:hint="eastAsia"/>
+          <w:rFonts w:asciiTheme="minorHAnsi" w:eastAsiaTheme="minorEastAsia" w:hAnsiTheme="minorHAnsi"/>
           <w:noProof/>
           <w:kern w:val="2"/>
           <w:szCs w:val="24"/>
@@ -2383,7 +2353,7 @@
         </w:tabs>
         <w:ind w:left="440"/>
         <w:rPr>
-          <w:rFonts w:asciiTheme="minorHAnsi" w:eastAsiaTheme="minorEastAsia" w:hAnsiTheme="minorHAnsi" w:hint="eastAsia"/>
+          <w:rFonts w:asciiTheme="minorHAnsi" w:eastAsiaTheme="minorEastAsia" w:hAnsiTheme="minorHAnsi"/>
           <w:noProof/>
           <w:kern w:val="2"/>
           <w:szCs w:val="24"/>
@@ -2480,7 +2450,7 @@
         </w:tabs>
         <w:ind w:left="880"/>
         <w:rPr>
-          <w:rFonts w:asciiTheme="minorHAnsi" w:eastAsiaTheme="minorEastAsia" w:hAnsiTheme="minorHAnsi" w:hint="eastAsia"/>
+          <w:rFonts w:asciiTheme="minorHAnsi" w:eastAsiaTheme="minorEastAsia" w:hAnsiTheme="minorHAnsi"/>
           <w:noProof/>
           <w:kern w:val="2"/>
           <w:szCs w:val="24"/>
@@ -2577,7 +2547,7 @@
         </w:tabs>
         <w:ind w:left="880"/>
         <w:rPr>
-          <w:rFonts w:asciiTheme="minorHAnsi" w:eastAsiaTheme="minorEastAsia" w:hAnsiTheme="minorHAnsi" w:hint="eastAsia"/>
+          <w:rFonts w:asciiTheme="minorHAnsi" w:eastAsiaTheme="minorEastAsia" w:hAnsiTheme="minorHAnsi"/>
           <w:noProof/>
           <w:kern w:val="2"/>
           <w:szCs w:val="24"/>
@@ -2673,7 +2643,7 @@
         </w:tabs>
         <w:ind w:left="880"/>
         <w:rPr>
-          <w:rFonts w:asciiTheme="minorHAnsi" w:eastAsiaTheme="minorEastAsia" w:hAnsiTheme="minorHAnsi" w:hint="eastAsia"/>
+          <w:rFonts w:asciiTheme="minorHAnsi" w:eastAsiaTheme="minorEastAsia" w:hAnsiTheme="minorHAnsi"/>
           <w:noProof/>
           <w:kern w:val="2"/>
           <w:szCs w:val="24"/>
@@ -2770,7 +2740,7 @@
         </w:tabs>
         <w:ind w:left="880"/>
         <w:rPr>
-          <w:rFonts w:asciiTheme="minorHAnsi" w:eastAsiaTheme="minorEastAsia" w:hAnsiTheme="minorHAnsi" w:hint="eastAsia"/>
+          <w:rFonts w:asciiTheme="minorHAnsi" w:eastAsiaTheme="minorEastAsia" w:hAnsiTheme="minorHAnsi"/>
           <w:noProof/>
           <w:kern w:val="2"/>
           <w:szCs w:val="24"/>
@@ -2867,7 +2837,7 @@
         </w:tabs>
         <w:ind w:left="880"/>
         <w:rPr>
-          <w:rFonts w:asciiTheme="minorHAnsi" w:eastAsiaTheme="minorEastAsia" w:hAnsiTheme="minorHAnsi" w:hint="eastAsia"/>
+          <w:rFonts w:asciiTheme="minorHAnsi" w:eastAsiaTheme="minorEastAsia" w:hAnsiTheme="minorHAnsi"/>
           <w:noProof/>
           <w:kern w:val="2"/>
           <w:szCs w:val="24"/>
@@ -2963,7 +2933,7 @@
         </w:tabs>
         <w:ind w:left="880"/>
         <w:rPr>
-          <w:rFonts w:asciiTheme="minorHAnsi" w:eastAsiaTheme="minorEastAsia" w:hAnsiTheme="minorHAnsi" w:hint="eastAsia"/>
+          <w:rFonts w:asciiTheme="minorHAnsi" w:eastAsiaTheme="minorEastAsia" w:hAnsiTheme="minorHAnsi"/>
           <w:noProof/>
           <w:kern w:val="2"/>
           <w:szCs w:val="24"/>
@@ -3060,7 +3030,7 @@
         </w:tabs>
         <w:ind w:left="880"/>
         <w:rPr>
-          <w:rFonts w:asciiTheme="minorHAnsi" w:eastAsiaTheme="minorEastAsia" w:hAnsiTheme="minorHAnsi" w:hint="eastAsia"/>
+          <w:rFonts w:asciiTheme="minorHAnsi" w:eastAsiaTheme="minorEastAsia" w:hAnsiTheme="minorHAnsi"/>
           <w:noProof/>
           <w:kern w:val="2"/>
           <w:szCs w:val="24"/>
@@ -3157,7 +3127,7 @@
         </w:tabs>
         <w:ind w:left="880"/>
         <w:rPr>
-          <w:rFonts w:asciiTheme="minorHAnsi" w:eastAsiaTheme="minorEastAsia" w:hAnsiTheme="minorHAnsi" w:hint="eastAsia"/>
+          <w:rFonts w:asciiTheme="minorHAnsi" w:eastAsiaTheme="minorEastAsia" w:hAnsiTheme="minorHAnsi"/>
           <w:noProof/>
           <w:kern w:val="2"/>
           <w:szCs w:val="24"/>
@@ -3254,7 +3224,7 @@
         </w:tabs>
         <w:ind w:left="440"/>
         <w:rPr>
-          <w:rFonts w:asciiTheme="minorHAnsi" w:eastAsiaTheme="minorEastAsia" w:hAnsiTheme="minorHAnsi" w:hint="eastAsia"/>
+          <w:rFonts w:asciiTheme="minorHAnsi" w:eastAsiaTheme="minorEastAsia" w:hAnsiTheme="minorHAnsi"/>
           <w:noProof/>
           <w:kern w:val="2"/>
           <w:szCs w:val="24"/>
@@ -3351,7 +3321,7 @@
         </w:tabs>
         <w:ind w:left="880"/>
         <w:rPr>
-          <w:rFonts w:asciiTheme="minorHAnsi" w:eastAsiaTheme="minorEastAsia" w:hAnsiTheme="minorHAnsi" w:hint="eastAsia"/>
+          <w:rFonts w:asciiTheme="minorHAnsi" w:eastAsiaTheme="minorEastAsia" w:hAnsiTheme="minorHAnsi"/>
           <w:noProof/>
           <w:kern w:val="2"/>
           <w:szCs w:val="24"/>
@@ -3447,7 +3417,7 @@
         </w:tabs>
         <w:ind w:left="880"/>
         <w:rPr>
-          <w:rFonts w:asciiTheme="minorHAnsi" w:eastAsiaTheme="minorEastAsia" w:hAnsiTheme="minorHAnsi" w:hint="eastAsia"/>
+          <w:rFonts w:asciiTheme="minorHAnsi" w:eastAsiaTheme="minorEastAsia" w:hAnsiTheme="minorHAnsi"/>
           <w:noProof/>
           <w:kern w:val="2"/>
           <w:szCs w:val="24"/>
@@ -3544,7 +3514,7 @@
         </w:tabs>
         <w:ind w:left="880"/>
         <w:rPr>
-          <w:rFonts w:asciiTheme="minorHAnsi" w:eastAsiaTheme="minorEastAsia" w:hAnsiTheme="minorHAnsi" w:hint="eastAsia"/>
+          <w:rFonts w:asciiTheme="minorHAnsi" w:eastAsiaTheme="minorEastAsia" w:hAnsiTheme="minorHAnsi"/>
           <w:noProof/>
           <w:kern w:val="2"/>
           <w:szCs w:val="24"/>
@@ -3641,7 +3611,7 @@
         </w:tabs>
         <w:ind w:left="880"/>
         <w:rPr>
-          <w:rFonts w:asciiTheme="minorHAnsi" w:eastAsiaTheme="minorEastAsia" w:hAnsiTheme="minorHAnsi" w:hint="eastAsia"/>
+          <w:rFonts w:asciiTheme="minorHAnsi" w:eastAsiaTheme="minorEastAsia" w:hAnsiTheme="minorHAnsi"/>
           <w:noProof/>
           <w:kern w:val="2"/>
           <w:szCs w:val="24"/>
@@ -3738,7 +3708,7 @@
         </w:tabs>
         <w:ind w:left="880"/>
         <w:rPr>
-          <w:rFonts w:asciiTheme="minorHAnsi" w:eastAsiaTheme="minorEastAsia" w:hAnsiTheme="minorHAnsi" w:hint="eastAsia"/>
+          <w:rFonts w:asciiTheme="minorHAnsi" w:eastAsiaTheme="minorEastAsia" w:hAnsiTheme="minorHAnsi"/>
           <w:noProof/>
           <w:kern w:val="2"/>
           <w:szCs w:val="24"/>
@@ -3835,7 +3805,7 @@
         </w:tabs>
         <w:ind w:left="880"/>
         <w:rPr>
-          <w:rFonts w:asciiTheme="minorHAnsi" w:eastAsiaTheme="minorEastAsia" w:hAnsiTheme="minorHAnsi" w:hint="eastAsia"/>
+          <w:rFonts w:asciiTheme="minorHAnsi" w:eastAsiaTheme="minorEastAsia" w:hAnsiTheme="minorHAnsi"/>
           <w:noProof/>
           <w:kern w:val="2"/>
           <w:szCs w:val="24"/>
@@ -3932,7 +3902,7 @@
         </w:tabs>
         <w:ind w:left="880"/>
         <w:rPr>
-          <w:rFonts w:asciiTheme="minorHAnsi" w:eastAsiaTheme="minorEastAsia" w:hAnsiTheme="minorHAnsi" w:hint="eastAsia"/>
+          <w:rFonts w:asciiTheme="minorHAnsi" w:eastAsiaTheme="minorEastAsia" w:hAnsiTheme="minorHAnsi"/>
           <w:noProof/>
           <w:kern w:val="2"/>
           <w:szCs w:val="24"/>
@@ -4029,7 +3999,7 @@
         </w:tabs>
         <w:ind w:left="880"/>
         <w:rPr>
-          <w:rFonts w:asciiTheme="minorHAnsi" w:eastAsiaTheme="minorEastAsia" w:hAnsiTheme="minorHAnsi" w:hint="eastAsia"/>
+          <w:rFonts w:asciiTheme="minorHAnsi" w:eastAsiaTheme="minorEastAsia" w:hAnsiTheme="minorHAnsi"/>
           <w:noProof/>
           <w:kern w:val="2"/>
           <w:szCs w:val="24"/>
@@ -4126,7 +4096,7 @@
         </w:tabs>
         <w:ind w:left="440"/>
         <w:rPr>
-          <w:rFonts w:asciiTheme="minorHAnsi" w:eastAsiaTheme="minorEastAsia" w:hAnsiTheme="minorHAnsi" w:hint="eastAsia"/>
+          <w:rFonts w:asciiTheme="minorHAnsi" w:eastAsiaTheme="minorEastAsia" w:hAnsiTheme="minorHAnsi"/>
           <w:noProof/>
           <w:kern w:val="2"/>
           <w:szCs w:val="24"/>
@@ -4223,7 +4193,7 @@
         </w:tabs>
         <w:ind w:left="880"/>
         <w:rPr>
-          <w:rFonts w:asciiTheme="minorHAnsi" w:eastAsiaTheme="minorEastAsia" w:hAnsiTheme="minorHAnsi" w:hint="eastAsia"/>
+          <w:rFonts w:asciiTheme="minorHAnsi" w:eastAsiaTheme="minorEastAsia" w:hAnsiTheme="minorHAnsi"/>
           <w:noProof/>
           <w:kern w:val="2"/>
           <w:szCs w:val="24"/>
@@ -4319,7 +4289,7 @@
         </w:tabs>
         <w:ind w:left="880"/>
         <w:rPr>
-          <w:rFonts w:asciiTheme="minorHAnsi" w:eastAsiaTheme="minorEastAsia" w:hAnsiTheme="minorHAnsi" w:hint="eastAsia"/>
+          <w:rFonts w:asciiTheme="minorHAnsi" w:eastAsiaTheme="minorEastAsia" w:hAnsiTheme="minorHAnsi"/>
           <w:noProof/>
           <w:kern w:val="2"/>
           <w:szCs w:val="24"/>
@@ -4415,7 +4385,7 @@
         </w:tabs>
         <w:ind w:left="880"/>
         <w:rPr>
-          <w:rFonts w:asciiTheme="minorHAnsi" w:eastAsiaTheme="minorEastAsia" w:hAnsiTheme="minorHAnsi" w:hint="eastAsia"/>
+          <w:rFonts w:asciiTheme="minorHAnsi" w:eastAsiaTheme="minorEastAsia" w:hAnsiTheme="minorHAnsi"/>
           <w:noProof/>
           <w:kern w:val="2"/>
           <w:szCs w:val="24"/>
@@ -4511,7 +4481,7 @@
         </w:tabs>
         <w:ind w:left="880"/>
         <w:rPr>
-          <w:rFonts w:asciiTheme="minorHAnsi" w:eastAsiaTheme="minorEastAsia" w:hAnsiTheme="minorHAnsi" w:hint="eastAsia"/>
+          <w:rFonts w:asciiTheme="minorHAnsi" w:eastAsiaTheme="minorEastAsia" w:hAnsiTheme="minorHAnsi"/>
           <w:noProof/>
           <w:kern w:val="2"/>
           <w:szCs w:val="24"/>
@@ -4608,7 +4578,7 @@
         </w:tabs>
         <w:ind w:left="880"/>
         <w:rPr>
-          <w:rFonts w:asciiTheme="minorHAnsi" w:eastAsiaTheme="minorEastAsia" w:hAnsiTheme="minorHAnsi" w:hint="eastAsia"/>
+          <w:rFonts w:asciiTheme="minorHAnsi" w:eastAsiaTheme="minorEastAsia" w:hAnsiTheme="minorHAnsi"/>
           <w:noProof/>
           <w:kern w:val="2"/>
           <w:szCs w:val="24"/>
@@ -4705,7 +4675,7 @@
         </w:tabs>
         <w:ind w:left="880"/>
         <w:rPr>
-          <w:rFonts w:asciiTheme="minorHAnsi" w:eastAsiaTheme="minorEastAsia" w:hAnsiTheme="minorHAnsi" w:hint="eastAsia"/>
+          <w:rFonts w:asciiTheme="minorHAnsi" w:eastAsiaTheme="minorEastAsia" w:hAnsiTheme="minorHAnsi"/>
           <w:noProof/>
           <w:kern w:val="2"/>
           <w:szCs w:val="24"/>
@@ -4801,7 +4771,7 @@
         </w:tabs>
         <w:ind w:left="440"/>
         <w:rPr>
-          <w:rFonts w:asciiTheme="minorHAnsi" w:eastAsiaTheme="minorEastAsia" w:hAnsiTheme="minorHAnsi" w:hint="eastAsia"/>
+          <w:rFonts w:asciiTheme="minorHAnsi" w:eastAsiaTheme="minorEastAsia" w:hAnsiTheme="minorHAnsi"/>
           <w:noProof/>
           <w:kern w:val="2"/>
           <w:szCs w:val="24"/>
@@ -4898,7 +4868,7 @@
         </w:tabs>
         <w:ind w:left="880"/>
         <w:rPr>
-          <w:rFonts w:asciiTheme="minorHAnsi" w:eastAsiaTheme="minorEastAsia" w:hAnsiTheme="minorHAnsi" w:hint="eastAsia"/>
+          <w:rFonts w:asciiTheme="minorHAnsi" w:eastAsiaTheme="minorEastAsia" w:hAnsiTheme="minorHAnsi"/>
           <w:noProof/>
           <w:kern w:val="2"/>
           <w:szCs w:val="24"/>
@@ -4995,7 +4965,7 @@
         </w:tabs>
         <w:ind w:left="880"/>
         <w:rPr>
-          <w:rFonts w:asciiTheme="minorHAnsi" w:eastAsiaTheme="minorEastAsia" w:hAnsiTheme="minorHAnsi" w:hint="eastAsia"/>
+          <w:rFonts w:asciiTheme="minorHAnsi" w:eastAsiaTheme="minorEastAsia" w:hAnsiTheme="minorHAnsi"/>
           <w:noProof/>
           <w:kern w:val="2"/>
           <w:szCs w:val="24"/>
@@ -5091,7 +5061,7 @@
         </w:tabs>
         <w:ind w:left="880"/>
         <w:rPr>
-          <w:rFonts w:asciiTheme="minorHAnsi" w:eastAsiaTheme="minorEastAsia" w:hAnsiTheme="minorHAnsi" w:hint="eastAsia"/>
+          <w:rFonts w:asciiTheme="minorHAnsi" w:eastAsiaTheme="minorEastAsia" w:hAnsiTheme="minorHAnsi"/>
           <w:noProof/>
           <w:kern w:val="2"/>
           <w:szCs w:val="24"/>
@@ -5187,7 +5157,7 @@
         </w:tabs>
         <w:ind w:left="880"/>
         <w:rPr>
-          <w:rFonts w:asciiTheme="minorHAnsi" w:eastAsiaTheme="minorEastAsia" w:hAnsiTheme="minorHAnsi" w:hint="eastAsia"/>
+          <w:rFonts w:asciiTheme="minorHAnsi" w:eastAsiaTheme="minorEastAsia" w:hAnsiTheme="minorHAnsi"/>
           <w:noProof/>
           <w:kern w:val="2"/>
           <w:szCs w:val="24"/>
@@ -5283,7 +5253,7 @@
         </w:tabs>
         <w:ind w:left="880"/>
         <w:rPr>
-          <w:rFonts w:asciiTheme="minorHAnsi" w:eastAsiaTheme="minorEastAsia" w:hAnsiTheme="minorHAnsi" w:hint="eastAsia"/>
+          <w:rFonts w:asciiTheme="minorHAnsi" w:eastAsiaTheme="minorEastAsia" w:hAnsiTheme="minorHAnsi"/>
           <w:noProof/>
           <w:kern w:val="2"/>
           <w:szCs w:val="24"/>
@@ -5379,7 +5349,7 @@
         </w:tabs>
         <w:ind w:left="440"/>
         <w:rPr>
-          <w:rFonts w:asciiTheme="minorHAnsi" w:eastAsiaTheme="minorEastAsia" w:hAnsiTheme="minorHAnsi" w:hint="eastAsia"/>
+          <w:rFonts w:asciiTheme="minorHAnsi" w:eastAsiaTheme="minorEastAsia" w:hAnsiTheme="minorHAnsi"/>
           <w:noProof/>
           <w:kern w:val="2"/>
           <w:szCs w:val="24"/>
@@ -5476,7 +5446,7 @@
         </w:tabs>
         <w:ind w:left="880"/>
         <w:rPr>
-          <w:rFonts w:asciiTheme="minorHAnsi" w:eastAsiaTheme="minorEastAsia" w:hAnsiTheme="minorHAnsi" w:hint="eastAsia"/>
+          <w:rFonts w:asciiTheme="minorHAnsi" w:eastAsiaTheme="minorEastAsia" w:hAnsiTheme="minorHAnsi"/>
           <w:noProof/>
           <w:kern w:val="2"/>
           <w:szCs w:val="24"/>
@@ -5573,7 +5543,7 @@
         </w:tabs>
         <w:ind w:left="880"/>
         <w:rPr>
-          <w:rFonts w:asciiTheme="minorHAnsi" w:eastAsiaTheme="minorEastAsia" w:hAnsiTheme="minorHAnsi" w:hint="eastAsia"/>
+          <w:rFonts w:asciiTheme="minorHAnsi" w:eastAsiaTheme="minorEastAsia" w:hAnsiTheme="minorHAnsi"/>
           <w:noProof/>
           <w:kern w:val="2"/>
           <w:szCs w:val="24"/>
@@ -5669,7 +5639,7 @@
         </w:tabs>
         <w:ind w:left="880"/>
         <w:rPr>
-          <w:rFonts w:asciiTheme="minorHAnsi" w:eastAsiaTheme="minorEastAsia" w:hAnsiTheme="minorHAnsi" w:hint="eastAsia"/>
+          <w:rFonts w:asciiTheme="minorHAnsi" w:eastAsiaTheme="minorEastAsia" w:hAnsiTheme="minorHAnsi"/>
           <w:noProof/>
           <w:kern w:val="2"/>
           <w:szCs w:val="24"/>
@@ -5765,7 +5735,7 @@
         </w:tabs>
         <w:ind w:left="880"/>
         <w:rPr>
-          <w:rFonts w:asciiTheme="minorHAnsi" w:eastAsiaTheme="minorEastAsia" w:hAnsiTheme="minorHAnsi" w:hint="eastAsia"/>
+          <w:rFonts w:asciiTheme="minorHAnsi" w:eastAsiaTheme="minorEastAsia" w:hAnsiTheme="minorHAnsi"/>
           <w:noProof/>
           <w:kern w:val="2"/>
           <w:szCs w:val="24"/>
@@ -5861,7 +5831,7 @@
         </w:tabs>
         <w:ind w:left="880"/>
         <w:rPr>
-          <w:rFonts w:asciiTheme="minorHAnsi" w:eastAsiaTheme="minorEastAsia" w:hAnsiTheme="minorHAnsi" w:hint="eastAsia"/>
+          <w:rFonts w:asciiTheme="minorHAnsi" w:eastAsiaTheme="minorEastAsia" w:hAnsiTheme="minorHAnsi"/>
           <w:noProof/>
           <w:kern w:val="2"/>
           <w:szCs w:val="24"/>
@@ -5957,7 +5927,7 @@
         </w:tabs>
         <w:ind w:left="880"/>
         <w:rPr>
-          <w:rFonts w:asciiTheme="minorHAnsi" w:eastAsiaTheme="minorEastAsia" w:hAnsiTheme="minorHAnsi" w:hint="eastAsia"/>
+          <w:rFonts w:asciiTheme="minorHAnsi" w:eastAsiaTheme="minorEastAsia" w:hAnsiTheme="minorHAnsi"/>
           <w:noProof/>
           <w:kern w:val="2"/>
           <w:szCs w:val="24"/>
@@ -6054,7 +6024,7 @@
         </w:tabs>
         <w:ind w:left="880"/>
         <w:rPr>
-          <w:rFonts w:asciiTheme="minorHAnsi" w:eastAsiaTheme="minorEastAsia" w:hAnsiTheme="minorHAnsi" w:hint="eastAsia"/>
+          <w:rFonts w:asciiTheme="minorHAnsi" w:eastAsiaTheme="minorEastAsia" w:hAnsiTheme="minorHAnsi"/>
           <w:noProof/>
           <w:kern w:val="2"/>
           <w:szCs w:val="24"/>
@@ -6151,7 +6121,7 @@
         </w:tabs>
         <w:ind w:left="440"/>
         <w:rPr>
-          <w:rFonts w:asciiTheme="minorHAnsi" w:eastAsiaTheme="minorEastAsia" w:hAnsiTheme="minorHAnsi" w:hint="eastAsia"/>
+          <w:rFonts w:asciiTheme="minorHAnsi" w:eastAsiaTheme="minorEastAsia" w:hAnsiTheme="minorHAnsi"/>
           <w:noProof/>
           <w:kern w:val="2"/>
           <w:szCs w:val="24"/>
@@ -6248,7 +6218,7 @@
         </w:tabs>
         <w:ind w:left="880"/>
         <w:rPr>
-          <w:rFonts w:asciiTheme="minorHAnsi" w:eastAsiaTheme="minorEastAsia" w:hAnsiTheme="minorHAnsi" w:hint="eastAsia"/>
+          <w:rFonts w:asciiTheme="minorHAnsi" w:eastAsiaTheme="minorEastAsia" w:hAnsiTheme="minorHAnsi"/>
           <w:noProof/>
           <w:kern w:val="2"/>
           <w:szCs w:val="24"/>
@@ -6345,7 +6315,7 @@
         </w:tabs>
         <w:ind w:left="880"/>
         <w:rPr>
-          <w:rFonts w:asciiTheme="minorHAnsi" w:eastAsiaTheme="minorEastAsia" w:hAnsiTheme="minorHAnsi" w:hint="eastAsia"/>
+          <w:rFonts w:asciiTheme="minorHAnsi" w:eastAsiaTheme="minorEastAsia" w:hAnsiTheme="minorHAnsi"/>
           <w:noProof/>
           <w:kern w:val="2"/>
           <w:szCs w:val="24"/>
@@ -6442,7 +6412,7 @@
         </w:tabs>
         <w:ind w:left="880"/>
         <w:rPr>
-          <w:rFonts w:asciiTheme="minorHAnsi" w:eastAsiaTheme="minorEastAsia" w:hAnsiTheme="minorHAnsi" w:hint="eastAsia"/>
+          <w:rFonts w:asciiTheme="minorHAnsi" w:eastAsiaTheme="minorEastAsia" w:hAnsiTheme="minorHAnsi"/>
           <w:noProof/>
           <w:kern w:val="2"/>
           <w:szCs w:val="24"/>
@@ -6539,7 +6509,7 @@
         </w:tabs>
         <w:ind w:left="880"/>
         <w:rPr>
-          <w:rFonts w:asciiTheme="minorHAnsi" w:eastAsiaTheme="minorEastAsia" w:hAnsiTheme="minorHAnsi" w:hint="eastAsia"/>
+          <w:rFonts w:asciiTheme="minorHAnsi" w:eastAsiaTheme="minorEastAsia" w:hAnsiTheme="minorHAnsi"/>
           <w:noProof/>
           <w:kern w:val="2"/>
           <w:szCs w:val="24"/>
@@ -6635,7 +6605,7 @@
         </w:tabs>
         <w:ind w:left="880"/>
         <w:rPr>
-          <w:rFonts w:asciiTheme="minorHAnsi" w:eastAsiaTheme="minorEastAsia" w:hAnsiTheme="minorHAnsi" w:hint="eastAsia"/>
+          <w:rFonts w:asciiTheme="minorHAnsi" w:eastAsiaTheme="minorEastAsia" w:hAnsiTheme="minorHAnsi"/>
           <w:noProof/>
           <w:kern w:val="2"/>
           <w:szCs w:val="24"/>
@@ -6732,7 +6702,7 @@
         </w:tabs>
         <w:ind w:left="880"/>
         <w:rPr>
-          <w:rFonts w:asciiTheme="minorHAnsi" w:eastAsiaTheme="minorEastAsia" w:hAnsiTheme="minorHAnsi" w:hint="eastAsia"/>
+          <w:rFonts w:asciiTheme="minorHAnsi" w:eastAsiaTheme="minorEastAsia" w:hAnsiTheme="minorHAnsi"/>
           <w:noProof/>
           <w:kern w:val="2"/>
           <w:szCs w:val="24"/>
@@ -6828,7 +6798,7 @@
         </w:tabs>
         <w:ind w:left="880"/>
         <w:rPr>
-          <w:rFonts w:asciiTheme="minorHAnsi" w:eastAsiaTheme="minorEastAsia" w:hAnsiTheme="minorHAnsi" w:hint="eastAsia"/>
+          <w:rFonts w:asciiTheme="minorHAnsi" w:eastAsiaTheme="minorEastAsia" w:hAnsiTheme="minorHAnsi"/>
           <w:noProof/>
           <w:kern w:val="2"/>
           <w:szCs w:val="24"/>
@@ -6924,7 +6894,7 @@
           <w:tab w:val="right" w:leader="dot" w:pos="9169"/>
         </w:tabs>
         <w:rPr>
-          <w:rFonts w:asciiTheme="minorHAnsi" w:eastAsiaTheme="minorEastAsia" w:hAnsiTheme="minorHAnsi" w:hint="eastAsia"/>
+          <w:rFonts w:asciiTheme="minorHAnsi" w:eastAsiaTheme="minorEastAsia" w:hAnsiTheme="minorHAnsi"/>
           <w:noProof/>
           <w:kern w:val="2"/>
           <w:szCs w:val="24"/>
@@ -7020,7 +6990,7 @@
         </w:tabs>
         <w:ind w:left="440"/>
         <w:rPr>
-          <w:rFonts w:asciiTheme="minorHAnsi" w:eastAsiaTheme="minorEastAsia" w:hAnsiTheme="minorHAnsi" w:hint="eastAsia"/>
+          <w:rFonts w:asciiTheme="minorHAnsi" w:eastAsiaTheme="minorEastAsia" w:hAnsiTheme="minorHAnsi"/>
           <w:noProof/>
           <w:kern w:val="2"/>
           <w:szCs w:val="24"/>
@@ -7116,7 +7086,7 @@
         </w:tabs>
         <w:ind w:left="440"/>
         <w:rPr>
-          <w:rFonts w:asciiTheme="minorHAnsi" w:eastAsiaTheme="minorEastAsia" w:hAnsiTheme="minorHAnsi" w:hint="eastAsia"/>
+          <w:rFonts w:asciiTheme="minorHAnsi" w:eastAsiaTheme="minorEastAsia" w:hAnsiTheme="minorHAnsi"/>
           <w:noProof/>
           <w:kern w:val="2"/>
           <w:szCs w:val="24"/>
@@ -7212,7 +7182,7 @@
         </w:tabs>
         <w:ind w:left="440"/>
         <w:rPr>
-          <w:rFonts w:asciiTheme="minorHAnsi" w:eastAsiaTheme="minorEastAsia" w:hAnsiTheme="minorHAnsi" w:hint="eastAsia"/>
+          <w:rFonts w:asciiTheme="minorHAnsi" w:eastAsiaTheme="minorEastAsia" w:hAnsiTheme="minorHAnsi"/>
           <w:noProof/>
           <w:kern w:val="2"/>
           <w:szCs w:val="24"/>
@@ -7308,7 +7278,7 @@
           <w:tab w:val="right" w:leader="dot" w:pos="9169"/>
         </w:tabs>
         <w:rPr>
-          <w:rFonts w:asciiTheme="minorHAnsi" w:eastAsiaTheme="minorEastAsia" w:hAnsiTheme="minorHAnsi" w:hint="eastAsia"/>
+          <w:rFonts w:asciiTheme="minorHAnsi" w:eastAsiaTheme="minorEastAsia" w:hAnsiTheme="minorHAnsi"/>
           <w:noProof/>
           <w:kern w:val="2"/>
           <w:szCs w:val="24"/>
@@ -7403,7 +7373,7 @@
           <w:tab w:val="right" w:leader="dot" w:pos="9169"/>
         </w:tabs>
         <w:rPr>
-          <w:rFonts w:asciiTheme="minorHAnsi" w:eastAsiaTheme="minorEastAsia" w:hAnsiTheme="minorHAnsi" w:hint="eastAsia"/>
+          <w:rFonts w:asciiTheme="minorHAnsi" w:eastAsiaTheme="minorEastAsia" w:hAnsiTheme="minorHAnsi"/>
           <w:noProof/>
           <w:kern w:val="2"/>
           <w:szCs w:val="24"/>
@@ -8231,6 +8201,7 @@
     <w:p>
       <w:pPr>
         <w:rPr>
+          <w:rFonts w:hint="eastAsia"/>
           <w:lang w:eastAsia="zh-CN"/>
         </w:rPr>
       </w:pPr>
@@ -8422,6 +8393,7 @@
     <w:p>
       <w:pPr>
         <w:rPr>
+          <w:rFonts w:hint="eastAsia"/>
           <w:lang w:eastAsia="zh-CN"/>
         </w:rPr>
       </w:pPr>
@@ -9272,7 +9244,7 @@
                 <w:sz w:val="20"/>
                 <w:lang w:eastAsia="zh-CN"/>
               </w:rPr>
-              <w:t>分析学生、教师、管理员真实场景，确认教学闭环与 AI 边</w:t>
+              <w:t>分析学生、教师、管理员真实场景，确认</w:t>
             </w:r>
             <w:r>
               <w:rPr>
@@ -9280,7 +9252,7 @@
                 <w:lang w:eastAsia="zh-CN"/>
               </w:rPr>
               <w:lastRenderedPageBreak/>
-              <w:t>界</w:t>
+              <w:t>教学闭环与 AI 边界</w:t>
             </w:r>
           </w:p>
         </w:tc>
@@ -10103,6 +10075,7 @@
               <w:rPr>
                 <w:sz w:val="20"/>
               </w:rPr>
+              <w:lastRenderedPageBreak/>
               <w:t>部署与运维</w:t>
             </w:r>
             <w:proofErr w:type="spellEnd"/>
@@ -10148,15 +10121,7 @@
                 <w:sz w:val="20"/>
                 <w:lang w:eastAsia="zh-CN"/>
               </w:rPr>
-              <w:t xml:space="preserve">配置环境变量、服务启动、日志、备份、监控、AI </w:t>
-            </w:r>
-            <w:r>
-              <w:rPr>
-                <w:sz w:val="20"/>
-                <w:lang w:eastAsia="zh-CN"/>
-              </w:rPr>
-              <w:lastRenderedPageBreak/>
-              <w:t>限流和异常处理</w:t>
+              <w:t>配置环境变量、服务启动、日志、备份、监控、AI 限流和异常处理</w:t>
             </w:r>
           </w:p>
         </w:tc>
@@ -10178,7 +10143,6 @@
                 <w:sz w:val="20"/>
                 <w:lang w:eastAsia="zh-CN"/>
               </w:rPr>
-              <w:lastRenderedPageBreak/>
               <w:t>部署说明、运行检查、备份与监控方案</w:t>
             </w:r>
           </w:p>
@@ -11041,6 +11005,7 @@
               <w:rPr>
                 <w:sz w:val="20"/>
               </w:rPr>
+              <w:lastRenderedPageBreak/>
               <w:t>输入</w:t>
             </w:r>
             <w:proofErr w:type="spellEnd"/>
@@ -11188,7 +11153,6 @@
               <w:rPr>
                 <w:sz w:val="20"/>
               </w:rPr>
-              <w:lastRenderedPageBreak/>
               <w:t>异常或边界情况</w:t>
             </w:r>
             <w:proofErr w:type="spellEnd"/>
@@ -12204,6 +12168,7 @@
               <w:rPr>
                 <w:sz w:val="20"/>
               </w:rPr>
+              <w:lastRenderedPageBreak/>
               <w:t>权限要求</w:t>
             </w:r>
             <w:proofErr w:type="spellEnd"/>
@@ -12364,7 +12329,6 @@
               <w:rPr>
                 <w:sz w:val="20"/>
               </w:rPr>
-              <w:lastRenderedPageBreak/>
               <w:t>功能名称</w:t>
             </w:r>
             <w:proofErr w:type="spellEnd"/>
@@ -13282,6 +13246,7 @@
       </w:pPr>
       <w:bookmarkStart w:id="21" w:name="_Toc234335071"/>
       <w:r>
+        <w:lastRenderedPageBreak/>
         <w:t xml:space="preserve">3.2.2 </w:t>
       </w:r>
       <w:proofErr w:type="spellStart"/>
@@ -13546,15 +13511,7 @@
                 <w:sz w:val="20"/>
                 <w:lang w:eastAsia="zh-CN"/>
               </w:rPr>
-              <w:t>提交审核命令、审核意见、发布或下线命</w:t>
-            </w:r>
-            <w:r>
-              <w:rPr>
-                <w:sz w:val="20"/>
-                <w:lang w:eastAsia="zh-CN"/>
-              </w:rPr>
-              <w:lastRenderedPageBreak/>
-              <w:t>令。</w:t>
+              <w:t>提交审核命令、审核意见、发布或下线命令。</w:t>
             </w:r>
           </w:p>
         </w:tc>
@@ -13580,7 +13537,6 @@
               <w:rPr>
                 <w:sz w:val="20"/>
               </w:rPr>
-              <w:lastRenderedPageBreak/>
               <w:t>业务处理</w:t>
             </w:r>
             <w:proofErr w:type="spellEnd"/>
@@ -14629,6 +14585,7 @@
               <w:rPr>
                 <w:sz w:val="20"/>
               </w:rPr>
+              <w:lastRenderedPageBreak/>
               <w:t>业务处理</w:t>
             </w:r>
             <w:proofErr w:type="spellEnd"/>
@@ -14819,7 +14776,6 @@
       </w:pPr>
       <w:bookmarkStart w:id="24" w:name="_Toc234335074"/>
       <w:r>
-        <w:lastRenderedPageBreak/>
         <w:t xml:space="preserve">3.2.5 </w:t>
       </w:r>
       <w:proofErr w:type="spellStart"/>
@@ -15825,6 +15781,7 @@
         <w:rPr>
           <w:lang w:eastAsia="zh-CN"/>
         </w:rPr>
+        <w:lastRenderedPageBreak/>
         <w:t xml:space="preserve">3.2.7 </w:t>
       </w:r>
       <w:r>
@@ -16067,7 +16024,6 @@
               <w:rPr>
                 <w:sz w:val="20"/>
               </w:rPr>
-              <w:lastRenderedPageBreak/>
               <w:t>输入</w:t>
             </w:r>
             <w:proofErr w:type="spellEnd"/>
@@ -17154,6 +17110,7 @@
               <w:rPr>
                 <w:sz w:val="20"/>
               </w:rPr>
+              <w:lastRenderedPageBreak/>
               <w:t>业务处理</w:t>
             </w:r>
             <w:proofErr w:type="spellEnd"/>
@@ -17350,7 +17307,6 @@
         <w:rPr>
           <w:lang w:eastAsia="zh-CN"/>
         </w:rPr>
-        <w:lastRenderedPageBreak/>
         <w:t xml:space="preserve">3.3.2 </w:t>
       </w:r>
       <w:r>
@@ -18341,6 +18297,7 @@
         <w:rPr>
           <w:lang w:eastAsia="zh-CN"/>
         </w:rPr>
+        <w:lastRenderedPageBreak/>
         <w:t xml:space="preserve">3.3.4 </w:t>
       </w:r>
       <w:r>
@@ -18681,7 +18638,6 @@
               <w:rPr>
                 <w:sz w:val="20"/>
               </w:rPr>
-              <w:lastRenderedPageBreak/>
               <w:t>输出</w:t>
             </w:r>
             <w:proofErr w:type="spellEnd"/>
@@ -19655,6 +19611,7 @@
               <w:rPr>
                 <w:sz w:val="20"/>
               </w:rPr>
+              <w:lastRenderedPageBreak/>
               <w:t>业务处理</w:t>
             </w:r>
             <w:proofErr w:type="spellEnd"/>
@@ -19867,7 +19824,6 @@
         <w:rPr>
           <w:lang w:eastAsia="zh-CN"/>
         </w:rPr>
-        <w:lastRenderedPageBreak/>
         <w:t xml:space="preserve">3.3.7 AI </w:t>
       </w:r>
       <w:r>
@@ -20842,6 +20798,7 @@
         <w:rPr>
           <w:lang w:eastAsia="zh-CN"/>
         </w:rPr>
+        <w:lastRenderedPageBreak/>
         <w:t xml:space="preserve">3.4 </w:t>
       </w:r>
       <w:r>
@@ -21058,7 +21015,6 @@
               <w:rPr>
                 <w:sz w:val="20"/>
               </w:rPr>
-              <w:lastRenderedPageBreak/>
               <w:t>前置条件</w:t>
             </w:r>
             <w:proofErr w:type="spellEnd"/>
@@ -22068,6 +22024,7 @@
               <w:rPr>
                 <w:sz w:val="20"/>
               </w:rPr>
+              <w:lastRenderedPageBreak/>
               <w:t>输入</w:t>
             </w:r>
             <w:proofErr w:type="spellEnd"/>
@@ -23343,6 +23300,7 @@
       </w:pPr>
       <w:bookmarkStart w:id="43" w:name="_Toc234335093"/>
       <w:r>
+        <w:lastRenderedPageBreak/>
         <w:t xml:space="preserve">3.4.6 AI </w:t>
       </w:r>
       <w:proofErr w:type="spellStart"/>
@@ -23590,7 +23548,6 @@
               <w:rPr>
                 <w:sz w:val="20"/>
               </w:rPr>
-              <w:lastRenderedPageBreak/>
               <w:t>输入</w:t>
             </w:r>
             <w:proofErr w:type="spellEnd"/>
@@ -24556,6 +24513,7 @@
               <w:rPr>
                 <w:sz w:val="20"/>
               </w:rPr>
+              <w:lastRenderedPageBreak/>
               <w:t>前置条件</w:t>
             </w:r>
             <w:proofErr w:type="spellEnd"/>
@@ -24846,15 +24804,7 @@
                 <w:sz w:val="20"/>
                 <w:lang w:eastAsia="zh-CN"/>
               </w:rPr>
-              <w:t>用户只能编辑或删除本人未锁定内容；教师</w:t>
-            </w:r>
-            <w:r>
-              <w:rPr>
-                <w:sz w:val="20"/>
-                <w:lang w:eastAsia="zh-CN"/>
-              </w:rPr>
-              <w:lastRenderedPageBreak/>
-              <w:t>可治理本课程内容。</w:t>
+              <w:t>用户只能编辑或删除本人未锁定内容；教师可治理本课程内容。</w:t>
             </w:r>
           </w:p>
         </w:tc>
@@ -25834,6 +25784,7 @@
       </w:pPr>
       <w:bookmarkStart w:id="49" w:name="_Toc234335099"/>
       <w:r>
+        <w:lastRenderedPageBreak/>
         <w:t xml:space="preserve">3.5.5 </w:t>
       </w:r>
       <w:proofErr w:type="spellStart"/>
@@ -26130,7 +26081,6 @@
               <w:rPr>
                 <w:sz w:val="20"/>
               </w:rPr>
-              <w:lastRenderedPageBreak/>
               <w:t>业务处理</w:t>
             </w:r>
             <w:proofErr w:type="spellEnd"/>
@@ -27164,6 +27114,7 @@
               <w:rPr>
                 <w:sz w:val="20"/>
               </w:rPr>
+              <w:lastRenderedPageBreak/>
               <w:t>业务处理</w:t>
             </w:r>
             <w:proofErr w:type="spellEnd"/>
@@ -27354,7 +27305,6 @@
       </w:pPr>
       <w:bookmarkStart w:id="53" w:name="_Toc234335103"/>
       <w:r>
-        <w:lastRenderedPageBreak/>
         <w:t xml:space="preserve">3.6.3 </w:t>
       </w:r>
       <w:proofErr w:type="spellStart"/>
@@ -28436,6 +28386,7 @@
               <w:rPr>
                 <w:sz w:val="20"/>
               </w:rPr>
+              <w:lastRenderedPageBreak/>
               <w:t>功能名称</w:t>
             </w:r>
             <w:proofErr w:type="spellEnd"/>
@@ -28681,7 +28632,6 @@
               <w:rPr>
                 <w:sz w:val="20"/>
               </w:rPr>
-              <w:lastRenderedPageBreak/>
               <w:t>输出</w:t>
             </w:r>
             <w:proofErr w:type="spellEnd"/>
@@ -29841,6 +29791,7 @@
         <w:rPr>
           <w:lang w:eastAsia="zh-CN"/>
         </w:rPr>
+        <w:lastRenderedPageBreak/>
         <w:t xml:space="preserve">3.7 AI </w:t>
       </w:r>
       <w:r>
@@ -29958,7 +29909,6 @@
               <w:rPr>
                 <w:sz w:val="20"/>
               </w:rPr>
-              <w:lastRenderedPageBreak/>
               <w:t>功能名称</w:t>
             </w:r>
             <w:proofErr w:type="spellEnd"/>
@@ -31077,6 +31027,7 @@
               <w:rPr>
                 <w:sz w:val="20"/>
               </w:rPr>
+              <w:lastRenderedPageBreak/>
               <w:t>前置条件</w:t>
             </w:r>
             <w:proofErr w:type="spellEnd"/>
@@ -31273,7 +31224,6 @@
               <w:rPr>
                 <w:sz w:val="20"/>
               </w:rPr>
-              <w:lastRenderedPageBreak/>
               <w:t>异常或边界情况</w:t>
             </w:r>
             <w:proofErr w:type="spellEnd"/>
@@ -32333,6 +32283,7 @@
       </w:pPr>
       <w:bookmarkStart w:id="64" w:name="_Toc234335114"/>
       <w:r>
+        <w:lastRenderedPageBreak/>
         <w:t xml:space="preserve">3.7.6 AI </w:t>
       </w:r>
       <w:proofErr w:type="spellStart"/>
@@ -32590,7 +32541,6 @@
               <w:rPr>
                 <w:sz w:val="20"/>
               </w:rPr>
-              <w:lastRenderedPageBreak/>
               <w:t>输入</w:t>
             </w:r>
             <w:proofErr w:type="spellEnd"/>
@@ -33454,6 +33404,7 @@
                 <w:b/>
                 <w:sz w:val="20"/>
               </w:rPr>
+              <w:lastRenderedPageBreak/>
               <w:t>编号</w:t>
             </w:r>
             <w:proofErr w:type="spellEnd"/>
@@ -33698,7 +33649,6 @@
               <w:rPr>
                 <w:sz w:val="20"/>
               </w:rPr>
-              <w:lastRenderedPageBreak/>
               <w:t>P-03</w:t>
             </w:r>
           </w:p>
@@ -34525,6 +34475,7 @@
               <w:rPr>
                 <w:sz w:val="20"/>
               </w:rPr>
+              <w:lastRenderedPageBreak/>
               <w:t>认证与鉴权</w:t>
             </w:r>
             <w:proofErr w:type="spellEnd"/>
@@ -34667,7 +34618,6 @@
               <w:rPr>
                 <w:sz w:val="20"/>
               </w:rPr>
-              <w:lastRenderedPageBreak/>
               <w:t>资源归属权限</w:t>
             </w:r>
             <w:proofErr w:type="spellEnd"/>
@@ -35608,6 +35558,7 @@
               <w:rPr>
                 <w:sz w:val="20"/>
               </w:rPr>
+              <w:lastRenderedPageBreak/>
               <w:t>数据扩展</w:t>
             </w:r>
             <w:proofErr w:type="spellEnd"/>
@@ -35753,14 +35704,7 @@
               <w:rPr>
                 <w:sz w:val="20"/>
               </w:rPr>
-              <w:t>模型，可</w:t>
-            </w:r>
-            <w:r>
-              <w:rPr>
-                <w:sz w:val="20"/>
-              </w:rPr>
-              <w:lastRenderedPageBreak/>
-              <w:t>新增问答、摘要、推荐能力</w:t>
+              <w:t>模型，可新增问答、摘要、推荐能力</w:t>
             </w:r>
             <w:proofErr w:type="spellEnd"/>
             <w:r>
@@ -35789,7 +35733,6 @@
                 <w:sz w:val="20"/>
                 <w:lang w:eastAsia="zh-CN"/>
               </w:rPr>
-              <w:lastRenderedPageBreak/>
               <w:t>替换模型不改变权限、引用和人工确认原则。</w:t>
             </w:r>
           </w:p>
@@ -36077,883 +36020,6 @@
           <w:lang w:eastAsia="zh-CN"/>
         </w:rPr>
       </w:pPr>
-    </w:p>
-    <w:p>
-      <w:pPr>
-        <w:pStyle w:val="1"/>
-      </w:pPr>
-      <w:bookmarkStart w:id="70" w:name="_Toc234335120"/>
-      <w:proofErr w:type="spellStart"/>
-      <w:r>
-        <w:t>附录</w:t>
-      </w:r>
-      <w:proofErr w:type="spellEnd"/>
-      <w:r>
-        <w:t xml:space="preserve"> A </w:t>
-      </w:r>
-      <w:proofErr w:type="spellStart"/>
-      <w:r>
-        <w:t>自查结果</w:t>
-      </w:r>
-      <w:bookmarkEnd w:id="70"/>
-      <w:proofErr w:type="spellEnd"/>
-    </w:p>
-    <w:tbl>
-      <w:tblPr>
-        <w:tblStyle w:val="aff1"/>
-        <w:tblW w:w="0" w:type="auto"/>
-        <w:jc w:val="center"/>
-        <w:tblLook w:val="04A0" w:firstRow="1" w:lastRow="0" w:firstColumn="1" w:lastColumn="0" w:noHBand="0" w:noVBand="1"/>
-      </w:tblPr>
-      <w:tblGrid>
-        <w:gridCol w:w="4585"/>
-        <w:gridCol w:w="4584"/>
-      </w:tblGrid>
-      <w:tr>
-        <w:trPr>
-          <w:jc w:val="center"/>
-        </w:trPr>
-        <w:tc>
-          <w:tcPr>
-            <w:tcW w:w="4589" w:type="dxa"/>
-            <w:shd w:val="clear" w:color="auto" w:fill="D9EAF7"/>
-            <w:vAlign w:val="center"/>
-          </w:tcPr>
-          <w:p>
-            <w:pPr>
-              <w:spacing w:after="0"/>
-              <w:rPr>
-                <w:rFonts w:hint="eastAsia"/>
-              </w:rPr>
-            </w:pPr>
-            <w:proofErr w:type="spellStart"/>
-            <w:r>
-              <w:rPr>
-                <w:b/>
-                <w:sz w:val="20"/>
-              </w:rPr>
-              <w:t>检查项</w:t>
-            </w:r>
-            <w:proofErr w:type="spellEnd"/>
-          </w:p>
-        </w:tc>
-        <w:tc>
-          <w:tcPr>
-            <w:tcW w:w="4589" w:type="dxa"/>
-            <w:shd w:val="clear" w:color="auto" w:fill="D9EAF7"/>
-            <w:vAlign w:val="center"/>
-          </w:tcPr>
-          <w:p>
-            <w:pPr>
-              <w:spacing w:after="0"/>
-              <w:rPr>
-                <w:rFonts w:hint="eastAsia"/>
-              </w:rPr>
-            </w:pPr>
-            <w:proofErr w:type="spellStart"/>
-            <w:r>
-              <w:rPr>
-                <w:b/>
-                <w:sz w:val="20"/>
-              </w:rPr>
-              <w:t>结果</w:t>
-            </w:r>
-            <w:proofErr w:type="spellEnd"/>
-          </w:p>
-        </w:tc>
-      </w:tr>
-      <w:tr>
-        <w:trPr>
-          <w:jc w:val="center"/>
-        </w:trPr>
-        <w:tc>
-          <w:tcPr>
-            <w:tcW w:w="4589" w:type="dxa"/>
-            <w:vAlign w:val="center"/>
-          </w:tcPr>
-          <w:p>
-            <w:pPr>
-              <w:spacing w:after="0"/>
-              <w:rPr>
-                <w:rFonts w:hint="eastAsia"/>
-              </w:rPr>
-            </w:pPr>
-            <w:proofErr w:type="spellStart"/>
-            <w:r>
-              <w:rPr>
-                <w:sz w:val="20"/>
-              </w:rPr>
-              <w:t>四章结构</w:t>
-            </w:r>
-            <w:proofErr w:type="spellEnd"/>
-          </w:p>
-        </w:tc>
-        <w:tc>
-          <w:tcPr>
-            <w:tcW w:w="4589" w:type="dxa"/>
-            <w:vAlign w:val="center"/>
-          </w:tcPr>
-          <w:p>
-            <w:pPr>
-              <w:spacing w:after="0"/>
-              <w:rPr>
-                <w:rFonts w:hint="eastAsia"/>
-                <w:lang w:eastAsia="zh-CN"/>
-              </w:rPr>
-            </w:pPr>
-            <w:r>
-              <w:rPr>
-                <w:sz w:val="20"/>
-                <w:lang w:eastAsia="zh-CN"/>
-              </w:rPr>
-              <w:t>第一章至第四章齐全，未新增第五章主体。</w:t>
-            </w:r>
-          </w:p>
-        </w:tc>
-      </w:tr>
-      <w:tr>
-        <w:trPr>
-          <w:jc w:val="center"/>
-        </w:trPr>
-        <w:tc>
-          <w:tcPr>
-            <w:tcW w:w="4589" w:type="dxa"/>
-            <w:vAlign w:val="center"/>
-          </w:tcPr>
-          <w:p>
-            <w:pPr>
-              <w:spacing w:after="0"/>
-              <w:rPr>
-                <w:rFonts w:hint="eastAsia"/>
-              </w:rPr>
-            </w:pPr>
-            <w:proofErr w:type="spellStart"/>
-            <w:r>
-              <w:rPr>
-                <w:sz w:val="20"/>
-              </w:rPr>
-              <w:t>标题层级</w:t>
-            </w:r>
-            <w:proofErr w:type="spellEnd"/>
-          </w:p>
-        </w:tc>
-        <w:tc>
-          <w:tcPr>
-            <w:tcW w:w="4589" w:type="dxa"/>
-            <w:vAlign w:val="center"/>
-          </w:tcPr>
-          <w:p>
-            <w:pPr>
-              <w:spacing w:after="0"/>
-              <w:rPr>
-                <w:rFonts w:hint="eastAsia"/>
-                <w:lang w:eastAsia="zh-CN"/>
-              </w:rPr>
-            </w:pPr>
-            <w:r>
-              <w:rPr>
-                <w:sz w:val="20"/>
-                <w:lang w:eastAsia="zh-CN"/>
-              </w:rPr>
-              <w:t>Word 中第一章至第四章使用标题 1，1.1/2.1 等使用标题 2，3.1.1 等使用标题 3。</w:t>
-            </w:r>
-          </w:p>
-        </w:tc>
-      </w:tr>
-      <w:tr>
-        <w:trPr>
-          <w:jc w:val="center"/>
-        </w:trPr>
-        <w:tc>
-          <w:tcPr>
-            <w:tcW w:w="4589" w:type="dxa"/>
-            <w:vAlign w:val="center"/>
-          </w:tcPr>
-          <w:p>
-            <w:pPr>
-              <w:spacing w:after="0"/>
-              <w:rPr>
-                <w:rFonts w:hint="eastAsia"/>
-              </w:rPr>
-            </w:pPr>
-            <w:proofErr w:type="spellStart"/>
-            <w:r>
-              <w:rPr>
-                <w:sz w:val="20"/>
-              </w:rPr>
-              <w:t>占位符</w:t>
-            </w:r>
-            <w:proofErr w:type="spellEnd"/>
-          </w:p>
-        </w:tc>
-        <w:tc>
-          <w:tcPr>
-            <w:tcW w:w="4589" w:type="dxa"/>
-            <w:vAlign w:val="center"/>
-          </w:tcPr>
-          <w:p>
-            <w:pPr>
-              <w:spacing w:after="0"/>
-              <w:rPr>
-                <w:rFonts w:hint="eastAsia"/>
-                <w:lang w:eastAsia="zh-CN"/>
-              </w:rPr>
-            </w:pPr>
-            <w:r>
-              <w:rPr>
-                <w:sz w:val="20"/>
-                <w:lang w:eastAsia="zh-CN"/>
-              </w:rPr>
-              <w:t>未保留任何模板占位符；组号统一为第一组。</w:t>
-            </w:r>
-          </w:p>
-        </w:tc>
-      </w:tr>
-      <w:tr>
-        <w:trPr>
-          <w:jc w:val="center"/>
-        </w:trPr>
-        <w:tc>
-          <w:tcPr>
-            <w:tcW w:w="4589" w:type="dxa"/>
-            <w:vAlign w:val="center"/>
-          </w:tcPr>
-          <w:p>
-            <w:pPr>
-              <w:spacing w:after="0"/>
-              <w:rPr>
-                <w:rFonts w:hint="eastAsia"/>
-              </w:rPr>
-            </w:pPr>
-            <w:proofErr w:type="spellStart"/>
-            <w:r>
-              <w:rPr>
-                <w:sz w:val="20"/>
-              </w:rPr>
-              <w:t>项目名称</w:t>
-            </w:r>
-            <w:proofErr w:type="spellEnd"/>
-          </w:p>
-        </w:tc>
-        <w:tc>
-          <w:tcPr>
-            <w:tcW w:w="4589" w:type="dxa"/>
-            <w:vAlign w:val="center"/>
-          </w:tcPr>
-          <w:p>
-            <w:pPr>
-              <w:spacing w:after="0"/>
-              <w:rPr>
-                <w:rFonts w:hint="eastAsia"/>
-                <w:lang w:eastAsia="zh-CN"/>
-              </w:rPr>
-            </w:pPr>
-            <w:r>
-              <w:rPr>
-                <w:sz w:val="20"/>
-                <w:lang w:eastAsia="zh-CN"/>
-              </w:rPr>
-              <w:t>全文使用在线教育辅助教学系统，未出现错误项目名称。</w:t>
-            </w:r>
-          </w:p>
-        </w:tc>
-      </w:tr>
-      <w:tr>
-        <w:trPr>
-          <w:jc w:val="center"/>
-        </w:trPr>
-        <w:tc>
-          <w:tcPr>
-            <w:tcW w:w="4589" w:type="dxa"/>
-            <w:vAlign w:val="center"/>
-          </w:tcPr>
-          <w:p>
-            <w:pPr>
-              <w:spacing w:after="0"/>
-              <w:rPr>
-                <w:rFonts w:hint="eastAsia"/>
-              </w:rPr>
-            </w:pPr>
-            <w:r>
-              <w:rPr>
-                <w:sz w:val="20"/>
-              </w:rPr>
-              <w:t>Mermaid 图</w:t>
-            </w:r>
-          </w:p>
-        </w:tc>
-        <w:tc>
-          <w:tcPr>
-            <w:tcW w:w="4589" w:type="dxa"/>
-            <w:vAlign w:val="center"/>
-          </w:tcPr>
-          <w:p>
-            <w:pPr>
-              <w:spacing w:after="0"/>
-              <w:rPr>
-                <w:rFonts w:hint="eastAsia"/>
-              </w:rPr>
-            </w:pPr>
-            <w:proofErr w:type="spellStart"/>
-            <w:r>
-              <w:rPr>
-                <w:sz w:val="20"/>
-              </w:rPr>
-              <w:t>包含系统整体业务流程图和系统功能结构图源码，可复制到</w:t>
-            </w:r>
-            <w:proofErr w:type="spellEnd"/>
-            <w:r>
-              <w:rPr>
-                <w:sz w:val="20"/>
-              </w:rPr>
-              <w:t xml:space="preserve"> Mermaid Live Editor 或 </w:t>
-            </w:r>
-            <w:proofErr w:type="spellStart"/>
-            <w:r>
-              <w:rPr>
-                <w:sz w:val="20"/>
-              </w:rPr>
-              <w:t>ProcessOn</w:t>
-            </w:r>
-            <w:proofErr w:type="spellEnd"/>
-            <w:r>
-              <w:rPr>
-                <w:sz w:val="20"/>
-              </w:rPr>
-              <w:t xml:space="preserve"> </w:t>
-            </w:r>
-            <w:proofErr w:type="spellStart"/>
-            <w:r>
-              <w:rPr>
-                <w:sz w:val="20"/>
-              </w:rPr>
-              <w:t>绘制</w:t>
-            </w:r>
-            <w:proofErr w:type="spellEnd"/>
-            <w:r>
-              <w:rPr>
-                <w:sz w:val="20"/>
-              </w:rPr>
-              <w:t>。</w:t>
-            </w:r>
-          </w:p>
-        </w:tc>
-      </w:tr>
-      <w:tr>
-        <w:trPr>
-          <w:jc w:val="center"/>
-        </w:trPr>
-        <w:tc>
-          <w:tcPr>
-            <w:tcW w:w="4589" w:type="dxa"/>
-            <w:vAlign w:val="center"/>
-          </w:tcPr>
-          <w:p>
-            <w:pPr>
-              <w:spacing w:after="0"/>
-              <w:rPr>
-                <w:rFonts w:hint="eastAsia"/>
-              </w:rPr>
-            </w:pPr>
-            <w:proofErr w:type="spellStart"/>
-            <w:r>
-              <w:rPr>
-                <w:sz w:val="20"/>
-              </w:rPr>
-              <w:t>性能指标</w:t>
-            </w:r>
-            <w:proofErr w:type="spellEnd"/>
-          </w:p>
-        </w:tc>
-        <w:tc>
-          <w:tcPr>
-            <w:tcW w:w="4589" w:type="dxa"/>
-            <w:vAlign w:val="center"/>
-          </w:tcPr>
-          <w:p>
-            <w:pPr>
-              <w:spacing w:after="0"/>
-              <w:rPr>
-                <w:rFonts w:hint="eastAsia"/>
-                <w:lang w:eastAsia="zh-CN"/>
-              </w:rPr>
-            </w:pPr>
-            <w:r>
-              <w:rPr>
-                <w:sz w:val="20"/>
-                <w:lang w:eastAsia="zh-CN"/>
-              </w:rPr>
-              <w:t>性能指标具体、可测试，并标明为课程实训验收目标。</w:t>
-            </w:r>
-          </w:p>
-        </w:tc>
-      </w:tr>
-      <w:tr>
-        <w:trPr>
-          <w:jc w:val="center"/>
-        </w:trPr>
-        <w:tc>
-          <w:tcPr>
-            <w:tcW w:w="4589" w:type="dxa"/>
-            <w:vAlign w:val="center"/>
-          </w:tcPr>
-          <w:p>
-            <w:pPr>
-              <w:spacing w:after="0"/>
-              <w:rPr>
-                <w:rFonts w:hint="eastAsia"/>
-              </w:rPr>
-            </w:pPr>
-            <w:r>
-              <w:rPr>
-                <w:sz w:val="20"/>
-              </w:rPr>
-              <w:t xml:space="preserve">Word </w:t>
-            </w:r>
-            <w:proofErr w:type="spellStart"/>
-            <w:r>
-              <w:rPr>
-                <w:sz w:val="20"/>
-              </w:rPr>
-              <w:t>目录</w:t>
-            </w:r>
-            <w:proofErr w:type="spellEnd"/>
-          </w:p>
-        </w:tc>
-        <w:tc>
-          <w:tcPr>
-            <w:tcW w:w="4589" w:type="dxa"/>
-            <w:vAlign w:val="center"/>
-          </w:tcPr>
-          <w:p>
-            <w:pPr>
-              <w:spacing w:after="0"/>
-              <w:rPr>
-                <w:rFonts w:hint="eastAsia"/>
-              </w:rPr>
-            </w:pPr>
-            <w:proofErr w:type="spellStart"/>
-            <w:r>
-              <w:rPr>
-                <w:sz w:val="20"/>
-              </w:rPr>
-              <w:t>已插入可更新的</w:t>
-            </w:r>
-            <w:proofErr w:type="spellEnd"/>
-            <w:r>
-              <w:rPr>
-                <w:sz w:val="20"/>
-              </w:rPr>
-              <w:t xml:space="preserve"> Word TOC </w:t>
-            </w:r>
-            <w:proofErr w:type="spellStart"/>
-            <w:r>
-              <w:rPr>
-                <w:sz w:val="20"/>
-              </w:rPr>
-              <w:t>字段。打开</w:t>
-            </w:r>
-            <w:proofErr w:type="spellEnd"/>
-            <w:r>
-              <w:rPr>
-                <w:sz w:val="20"/>
-              </w:rPr>
-              <w:t xml:space="preserve"> Word </w:t>
-            </w:r>
-            <w:proofErr w:type="spellStart"/>
-            <w:proofErr w:type="gramStart"/>
-            <w:r>
-              <w:rPr>
-                <w:sz w:val="20"/>
-              </w:rPr>
-              <w:t>后右键目录选择“</w:t>
-            </w:r>
-            <w:proofErr w:type="gramEnd"/>
-            <w:r>
-              <w:rPr>
-                <w:sz w:val="20"/>
-              </w:rPr>
-              <w:t>更新域</w:t>
-            </w:r>
-            <w:proofErr w:type="spellEnd"/>
-            <w:r>
-              <w:rPr>
-                <w:sz w:val="20"/>
-              </w:rPr>
-              <w:t>/</w:t>
-            </w:r>
-            <w:proofErr w:type="spellStart"/>
-            <w:proofErr w:type="gramStart"/>
-            <w:r>
-              <w:rPr>
-                <w:sz w:val="20"/>
-              </w:rPr>
-              <w:t>更新整个目录</w:t>
-            </w:r>
-            <w:proofErr w:type="spellEnd"/>
-            <w:r>
-              <w:rPr>
-                <w:sz w:val="20"/>
-              </w:rPr>
-              <w:t>”。</w:t>
-            </w:r>
-            <w:proofErr w:type="gramEnd"/>
-          </w:p>
-        </w:tc>
-      </w:tr>
-      <w:tr>
-        <w:trPr>
-          <w:jc w:val="center"/>
-        </w:trPr>
-        <w:tc>
-          <w:tcPr>
-            <w:tcW w:w="4589" w:type="dxa"/>
-            <w:vAlign w:val="center"/>
-          </w:tcPr>
-          <w:p>
-            <w:pPr>
-              <w:spacing w:after="0"/>
-              <w:rPr>
-                <w:rFonts w:hint="eastAsia"/>
-              </w:rPr>
-            </w:pPr>
-            <w:proofErr w:type="spellStart"/>
-            <w:r>
-              <w:rPr>
-                <w:sz w:val="20"/>
-              </w:rPr>
-              <w:t>表格</w:t>
-            </w:r>
-            <w:proofErr w:type="spellEnd"/>
-          </w:p>
-        </w:tc>
-        <w:tc>
-          <w:tcPr>
-            <w:tcW w:w="4589" w:type="dxa"/>
-            <w:vAlign w:val="center"/>
-          </w:tcPr>
-          <w:p>
-            <w:pPr>
-              <w:spacing w:after="0"/>
-              <w:rPr>
-                <w:rFonts w:hint="eastAsia"/>
-                <w:lang w:eastAsia="zh-CN"/>
-              </w:rPr>
-            </w:pPr>
-            <w:r>
-              <w:rPr>
-                <w:sz w:val="20"/>
-                <w:lang w:eastAsia="zh-CN"/>
-              </w:rPr>
-              <w:t>所有表格均为 Word 可编辑表格，不使用截图。</w:t>
-            </w:r>
-          </w:p>
-        </w:tc>
-      </w:tr>
-    </w:tbl>
-    <w:p>
-      <w:pPr>
-        <w:rPr>
-          <w:rFonts w:hint="eastAsia"/>
-          <w:lang w:eastAsia="zh-CN"/>
-        </w:rPr>
-      </w:pPr>
-    </w:p>
-    <w:p>
-      <w:pPr>
-        <w:pStyle w:val="1"/>
-      </w:pPr>
-      <w:bookmarkStart w:id="71" w:name="_Toc234335121"/>
-      <w:proofErr w:type="spellStart"/>
-      <w:r>
-        <w:t>附录</w:t>
-      </w:r>
-      <w:proofErr w:type="spellEnd"/>
-      <w:r>
-        <w:t xml:space="preserve"> B </w:t>
-      </w:r>
-      <w:proofErr w:type="spellStart"/>
-      <w:r>
-        <w:t>使用的项目材料</w:t>
-      </w:r>
-      <w:bookmarkEnd w:id="71"/>
-      <w:proofErr w:type="spellEnd"/>
-    </w:p>
-    <w:p>
-      <w:pPr>
-        <w:pStyle w:val="a0"/>
-        <w:ind w:firstLine="0"/>
-        <w:rPr>
-          <w:rFonts w:hint="eastAsia"/>
-          <w:lang w:eastAsia="zh-CN"/>
-        </w:rPr>
-      </w:pPr>
-      <w:r>
-        <w:rPr>
-          <w:lang w:eastAsia="zh-CN"/>
-        </w:rPr>
-        <w:t>E:/第1组-</w:t>
-      </w:r>
-      <w:proofErr w:type="spellStart"/>
-      <w:r>
-        <w:rPr>
-          <w:lang w:eastAsia="zh-CN"/>
-        </w:rPr>
-        <w:t>Xxxx</w:t>
-      </w:r>
-      <w:proofErr w:type="spellEnd"/>
-      <w:r>
-        <w:rPr>
-          <w:lang w:eastAsia="zh-CN"/>
-        </w:rPr>
-        <w:t>需求规格说明书.doc</w:t>
-      </w:r>
-    </w:p>
-    <w:p>
-      <w:pPr>
-        <w:pStyle w:val="a0"/>
-        <w:ind w:firstLine="0"/>
-        <w:rPr>
-          <w:rFonts w:hint="eastAsia"/>
-        </w:rPr>
-      </w:pPr>
-      <w:r>
-        <w:t>design-research.md</w:t>
-      </w:r>
-    </w:p>
-    <w:p>
-      <w:pPr>
-        <w:pStyle w:val="a0"/>
-        <w:ind w:firstLine="0"/>
-        <w:rPr>
-          <w:rFonts w:hint="eastAsia"/>
-        </w:rPr>
-      </w:pPr>
-      <w:r>
-        <w:t>sitemap.md</w:t>
-      </w:r>
-    </w:p>
-    <w:p>
-      <w:pPr>
-        <w:pStyle w:val="a0"/>
-        <w:ind w:firstLine="0"/>
-        <w:rPr>
-          <w:rFonts w:hint="eastAsia"/>
-        </w:rPr>
-      </w:pPr>
-      <w:r>
-        <w:lastRenderedPageBreak/>
-        <w:t>ui-spec.md</w:t>
-      </w:r>
-    </w:p>
-    <w:p>
-      <w:pPr>
-        <w:pStyle w:val="a0"/>
-        <w:ind w:firstLine="0"/>
-        <w:rPr>
-          <w:rFonts w:hint="eastAsia"/>
-        </w:rPr>
-      </w:pPr>
-      <w:r>
-        <w:t>wireframes.md</w:t>
-      </w:r>
-    </w:p>
-    <w:p>
-      <w:pPr>
-        <w:pStyle w:val="a0"/>
-        <w:ind w:firstLine="0"/>
-        <w:rPr>
-          <w:rFonts w:hint="eastAsia"/>
-        </w:rPr>
-      </w:pPr>
-      <w:r>
-        <w:t>README.md</w:t>
-      </w:r>
-    </w:p>
-    <w:p>
-      <w:pPr>
-        <w:pStyle w:val="a0"/>
-        <w:ind w:firstLine="0"/>
-        <w:rPr>
-          <w:rFonts w:hint="eastAsia"/>
-        </w:rPr>
-      </w:pPr>
-      <w:r>
-        <w:t>CONTEXT.md</w:t>
-      </w:r>
-    </w:p>
-    <w:p>
-      <w:pPr>
-        <w:pStyle w:val="a0"/>
-        <w:ind w:firstLine="0"/>
-        <w:rPr>
-          <w:rFonts w:hint="eastAsia"/>
-        </w:rPr>
-      </w:pPr>
-      <w:r>
-        <w:t>docs/backend-architecture.md</w:t>
-      </w:r>
-    </w:p>
-    <w:p>
-      <w:pPr>
-        <w:pStyle w:val="a0"/>
-        <w:ind w:firstLine="0"/>
-        <w:rPr>
-          <w:rFonts w:hint="eastAsia"/>
-        </w:rPr>
-      </w:pPr>
-      <w:r>
-        <w:t>docs/api-style.md</w:t>
-      </w:r>
-    </w:p>
-    <w:p>
-      <w:pPr>
-        <w:pStyle w:val="a0"/>
-        <w:ind w:firstLine="0"/>
-        <w:rPr>
-          <w:rFonts w:hint="eastAsia"/>
-        </w:rPr>
-      </w:pPr>
-      <w:r>
-        <w:t>docs/database-conventions.md</w:t>
-      </w:r>
-    </w:p>
-    <w:p>
-      <w:pPr>
-        <w:pStyle w:val="a0"/>
-        <w:ind w:firstLine="0"/>
-        <w:rPr>
-          <w:rFonts w:hint="eastAsia"/>
-        </w:rPr>
-      </w:pPr>
-      <w:r>
-        <w:t>docs/course-module-design.md</w:t>
-      </w:r>
-    </w:p>
-    <w:p>
-      <w:pPr>
-        <w:pStyle w:val="a0"/>
-        <w:ind w:firstLine="0"/>
-        <w:rPr>
-          <w:rFonts w:hint="eastAsia"/>
-        </w:rPr>
-      </w:pPr>
-      <w:r>
-        <w:t>docs/course-api-contract.md</w:t>
-      </w:r>
-    </w:p>
-    <w:p>
-      <w:pPr>
-        <w:pStyle w:val="a0"/>
-        <w:ind w:firstLine="0"/>
-        <w:rPr>
-          <w:rFonts w:hint="eastAsia"/>
-        </w:rPr>
-      </w:pPr>
-      <w:r>
-        <w:t>docs/course-module-delivery.md</w:t>
-      </w:r>
-    </w:p>
-    <w:p>
-      <w:pPr>
-        <w:pStyle w:val="a0"/>
-        <w:ind w:firstLine="0"/>
-        <w:rPr>
-          <w:rFonts w:hint="eastAsia"/>
-        </w:rPr>
-      </w:pPr>
-      <w:r>
-        <w:t>docs/</w:t>
-      </w:r>
-      <w:proofErr w:type="spellStart"/>
-      <w:r>
-        <w:t>openapi</w:t>
-      </w:r>
-      <w:proofErr w:type="spellEnd"/>
-      <w:r>
-        <w:t>/course-</w:t>
-      </w:r>
-      <w:proofErr w:type="spellStart"/>
-      <w:r>
-        <w:t>module.openapi.yaml</w:t>
-      </w:r>
-      <w:proofErr w:type="spellEnd"/>
-    </w:p>
-    <w:p>
-      <w:pPr>
-        <w:pStyle w:val="a0"/>
-        <w:ind w:firstLine="0"/>
-        <w:rPr>
-          <w:rFonts w:hint="eastAsia"/>
-        </w:rPr>
-      </w:pPr>
-      <w:r>
-        <w:t>backend/README.md</w:t>
-      </w:r>
-    </w:p>
-    <w:p>
-      <w:pPr>
-        <w:pStyle w:val="a0"/>
-        <w:ind w:firstLine="0"/>
-        <w:rPr>
-          <w:rFonts w:hint="eastAsia"/>
-        </w:rPr>
-      </w:pPr>
-      <w:r>
-        <w:t>backend/pom.xml</w:t>
-      </w:r>
-    </w:p>
-    <w:p>
-      <w:pPr>
-        <w:pStyle w:val="a0"/>
-        <w:ind w:firstLine="0"/>
-        <w:rPr>
-          <w:rFonts w:hint="eastAsia"/>
-        </w:rPr>
-      </w:pPr>
-      <w:proofErr w:type="spellStart"/>
-      <w:proofErr w:type="gramStart"/>
-      <w:r>
-        <w:t>package.json</w:t>
-      </w:r>
-      <w:proofErr w:type="spellEnd"/>
-      <w:proofErr w:type="gramEnd"/>
-    </w:p>
-    <w:p>
-      <w:pPr>
-        <w:pStyle w:val="a0"/>
-        <w:ind w:firstLine="0"/>
-        <w:rPr>
-          <w:rFonts w:hint="eastAsia"/>
-        </w:rPr>
-      </w:pPr>
-      <w:r>
-        <w:t>backend/edu-biz-service/src/main/resources/db/migration/V1__init_auth_tables.sql</w:t>
-      </w:r>
-    </w:p>
-    <w:p>
-      <w:pPr>
-        <w:pStyle w:val="a0"/>
-        <w:ind w:firstLine="0"/>
-        <w:rPr>
-          <w:rFonts w:hint="eastAsia"/>
-        </w:rPr>
-      </w:pPr>
-      <w:r>
-        <w:t>backend/edu-biz-service/src/main/resources/db/migration/V2__create_course_tables.sql</w:t>
-      </w:r>
-    </w:p>
-    <w:p>
-      <w:pPr>
-        <w:pStyle w:val="a0"/>
-        <w:ind w:firstLine="0"/>
-        <w:rPr>
-          <w:rFonts w:hint="eastAsia"/>
-        </w:rPr>
-      </w:pPr>
-      <w:r>
-        <w:t>backend/edu-biz-service/src/main/resources/db/migration/V3__create_course_review_table.sql</w:t>
-      </w:r>
     </w:p>
     <w:sectPr>
       <w:footerReference w:type="default" r:id="rId13"/>
@@ -37875,6 +36941,7 @@
   <w:style w:type="character" w:default="1" w:styleId="a2">
     <w:name w:val="Default Paragraph Font"/>
     <w:uiPriority w:val="1"/>
+    <w:semiHidden/>
     <w:unhideWhenUsed/>
   </w:style>
   <w:style w:type="table" w:default="1" w:styleId="a3">

</xml_diff>